<commit_message>
docs(skpl): docx with 4.1 BPMN
</commit_message>
<xml_diff>
--- a/docs/skpl/SKPL Website Top Up valostock.docx
+++ b/docs/skpl/SKPL Website Top Up valostock.docx
@@ -154,7 +154,7 @@
           <w:left w:w="10" w:type="dxa"/>
           <w:right w:w="10" w:type="dxa"/>
         </w:tblCellMar>
-        <w:tblLook w:val="0000" w:firstRow="0" w:lastRow="0" w:firstColumn="0" w:lastColumn="0" w:noHBand="0" w:noVBand="0"/>
+        <w:tblLook w:val="04A0" w:firstRow="1" w:lastRow="0" w:firstColumn="1" w:lastColumn="0" w:noHBand="0" w:noVBand="1"/>
       </w:tblPr>
       <w:tblGrid>
         <w:gridCol w:w="1510"/>
@@ -197,7 +197,7 @@
                 <w:noProof/>
               </w:rPr>
               <w:drawing>
-                <wp:inline distT="0" distB="0" distL="0" distR="0" wp14:anchorId="71798611" wp14:editId="5E192E8A">
+                <wp:inline distT="0" distB="0" distL="0" distR="0" wp14:anchorId="5EB8AAB1" wp14:editId="6D793E03">
                   <wp:extent cx="857250" cy="200025"/>
                   <wp:effectExtent l="0" t="0" r="0" b="0"/>
                   <wp:docPr id="1" name="Picture 1"/>
@@ -467,7 +467,7 @@
                 <w:iCs/>
                 <w:noProof/>
               </w:rPr>
-              <w:t>16</w:t>
+              <w:t>27</w:t>
             </w:r>
             <w:r>
               <w:rPr>
@@ -652,7 +652,7 @@
     <w:sdt>
       <w:sdtPr>
         <w:alias w:val="Daftar Isi"/>
-        <w:id w:val="-1502963276"/>
+        <w:id w:val="485827269"/>
       </w:sdtPr>
       <w:sdtEndPr/>
       <w:sdtContent>
@@ -681,7 +681,7 @@
           <w:r>
             <w:fldChar w:fldCharType="separate"/>
           </w:r>
-          <w:hyperlink w:anchor="_Toc241588096" w:history="1">
+          <w:hyperlink w:anchor="_Toc241589334" w:history="1">
             <w:r>
               <w:rPr>
                 <w:rStyle w:val="Hyperlink"/>
@@ -723,7 +723,7 @@
               <w:rPr>
                 <w:noProof/>
               </w:rPr>
-              <w:instrText xml:space="preserve"> PAGEREF _Toc241588096 \h </w:instrText>
+              <w:instrText xml:space="preserve"> PAGEREF _Toc241589334 \h </w:instrText>
             </w:r>
             <w:r>
               <w:rPr>
@@ -766,7 +766,7 @@
               <w14:ligatures w14:val="standardContextual"/>
             </w:rPr>
           </w:pPr>
-          <w:hyperlink w:anchor="_Toc241588097" w:history="1">
+          <w:hyperlink w:anchor="_Toc241589335" w:history="1">
             <w:r>
               <w:rPr>
                 <w:rStyle w:val="Hyperlink"/>
@@ -808,7 +808,7 @@
               <w:rPr>
                 <w:noProof/>
               </w:rPr>
-              <w:instrText xml:space="preserve"> PAGEREF _Toc241588097 \h </w:instrText>
+              <w:instrText xml:space="preserve"> PAGEREF _Toc241589335 \h </w:instrText>
             </w:r>
             <w:r>
               <w:rPr>
@@ -851,7 +851,7 @@
               <w14:ligatures w14:val="standardContextual"/>
             </w:rPr>
           </w:pPr>
-          <w:hyperlink w:anchor="_Toc241588098" w:history="1">
+          <w:hyperlink w:anchor="_Toc241589336" w:history="1">
             <w:r>
               <w:rPr>
                 <w:rStyle w:val="Hyperlink"/>
@@ -893,7 +893,7 @@
               <w:rPr>
                 <w:noProof/>
               </w:rPr>
-              <w:instrText xml:space="preserve"> PAGEREF _Toc241588098 \h </w:instrText>
+              <w:instrText xml:space="preserve"> PAGEREF _Toc241589336 \h </w:instrText>
             </w:r>
             <w:r>
               <w:rPr>
@@ -936,7 +936,7 @@
               <w14:ligatures w14:val="standardContextual"/>
             </w:rPr>
           </w:pPr>
-          <w:hyperlink w:anchor="_Toc241588099" w:history="1">
+          <w:hyperlink w:anchor="_Toc241589337" w:history="1">
             <w:r>
               <w:rPr>
                 <w:rStyle w:val="Hyperlink"/>
@@ -978,7 +978,7 @@
               <w:rPr>
                 <w:noProof/>
               </w:rPr>
-              <w:instrText xml:space="preserve"> PAGEREF _Toc241588099 \h </w:instrText>
+              <w:instrText xml:space="preserve"> PAGEREF _Toc241589337 \h </w:instrText>
             </w:r>
             <w:r>
               <w:rPr>
@@ -1021,7 +1021,7 @@
               <w14:ligatures w14:val="standardContextual"/>
             </w:rPr>
           </w:pPr>
-          <w:hyperlink w:anchor="_Toc241588100" w:history="1">
+          <w:hyperlink w:anchor="_Toc241589338" w:history="1">
             <w:r>
               <w:rPr>
                 <w:rStyle w:val="Hyperlink"/>
@@ -1063,7 +1063,7 @@
               <w:rPr>
                 <w:noProof/>
               </w:rPr>
-              <w:instrText xml:space="preserve"> PAGEREF _Toc241588100 \h </w:instrText>
+              <w:instrText xml:space="preserve"> PAGEREF _Toc241589338 \h </w:instrText>
             </w:r>
             <w:r>
               <w:rPr>
@@ -1106,7 +1106,7 @@
               <w14:ligatures w14:val="standardContextual"/>
             </w:rPr>
           </w:pPr>
-          <w:hyperlink w:anchor="_Toc241588101" w:history="1">
+          <w:hyperlink w:anchor="_Toc241589339" w:history="1">
             <w:r>
               <w:rPr>
                 <w:rStyle w:val="Hyperlink"/>
@@ -1148,7 +1148,7 @@
               <w:rPr>
                 <w:noProof/>
               </w:rPr>
-              <w:instrText xml:space="preserve"> PAGEREF _Toc241588101 \h </w:instrText>
+              <w:instrText xml:space="preserve"> PAGEREF _Toc241589339 \h </w:instrText>
             </w:r>
             <w:r>
               <w:rPr>
@@ -1191,7 +1191,7 @@
               <w14:ligatures w14:val="standardContextual"/>
             </w:rPr>
           </w:pPr>
-          <w:hyperlink w:anchor="_Toc241588102" w:history="1">
+          <w:hyperlink w:anchor="_Toc241589340" w:history="1">
             <w:r>
               <w:rPr>
                 <w:rStyle w:val="Hyperlink"/>
@@ -1233,7 +1233,7 @@
               <w:rPr>
                 <w:noProof/>
               </w:rPr>
-              <w:instrText xml:space="preserve"> PAGEREF _Toc241588102 \h </w:instrText>
+              <w:instrText xml:space="preserve"> PAGEREF _Toc241589340 \h </w:instrText>
             </w:r>
             <w:r>
               <w:rPr>
@@ -1276,7 +1276,7 @@
               <w14:ligatures w14:val="standardContextual"/>
             </w:rPr>
           </w:pPr>
-          <w:hyperlink w:anchor="_Toc241588103" w:history="1">
+          <w:hyperlink w:anchor="_Toc241589341" w:history="1">
             <w:r>
               <w:rPr>
                 <w:rStyle w:val="Hyperlink"/>
@@ -1318,7 +1318,7 @@
               <w:rPr>
                 <w:noProof/>
               </w:rPr>
-              <w:instrText xml:space="preserve"> PAGEREF _Toc241588103 \h </w:instrText>
+              <w:instrText xml:space="preserve"> PAGEREF _Toc241589341 \h </w:instrText>
             </w:r>
             <w:r>
               <w:rPr>
@@ -1361,7 +1361,7 @@
               <w14:ligatures w14:val="standardContextual"/>
             </w:rPr>
           </w:pPr>
-          <w:hyperlink w:anchor="_Toc241588104" w:history="1">
+          <w:hyperlink w:anchor="_Toc241589342" w:history="1">
             <w:r>
               <w:rPr>
                 <w:rStyle w:val="Hyperlink"/>
@@ -1403,7 +1403,7 @@
               <w:rPr>
                 <w:noProof/>
               </w:rPr>
-              <w:instrText xml:space="preserve"> PAGEREF _Toc241588104 \h </w:instrText>
+              <w:instrText xml:space="preserve"> PAGEREF _Toc241589342 \h </w:instrText>
             </w:r>
             <w:r>
               <w:rPr>
@@ -1446,7 +1446,7 @@
               <w14:ligatures w14:val="standardContextual"/>
             </w:rPr>
           </w:pPr>
-          <w:hyperlink w:anchor="_Toc241588105" w:history="1">
+          <w:hyperlink w:anchor="_Toc241589343" w:history="1">
             <w:r>
               <w:rPr>
                 <w:rStyle w:val="Hyperlink"/>
@@ -1488,7 +1488,7 @@
               <w:rPr>
                 <w:noProof/>
               </w:rPr>
-              <w:instrText xml:space="preserve"> PAGEREF _Toc241588105 \h </w:instrText>
+              <w:instrText xml:space="preserve"> PAGEREF _Toc241589343 \h </w:instrText>
             </w:r>
             <w:r>
               <w:rPr>
@@ -1531,7 +1531,7 @@
               <w14:ligatures w14:val="standardContextual"/>
             </w:rPr>
           </w:pPr>
-          <w:hyperlink w:anchor="_Toc241588106" w:history="1">
+          <w:hyperlink w:anchor="_Toc241589344" w:history="1">
             <w:r>
               <w:rPr>
                 <w:rStyle w:val="Hyperlink"/>
@@ -1573,7 +1573,7 @@
               <w:rPr>
                 <w:noProof/>
               </w:rPr>
-              <w:instrText xml:space="preserve"> PAGEREF _Toc241588106 \h </w:instrText>
+              <w:instrText xml:space="preserve"> PAGEREF _Toc241589344 \h </w:instrText>
             </w:r>
             <w:r>
               <w:rPr>
@@ -1616,7 +1616,7 @@
               <w14:ligatures w14:val="standardContextual"/>
             </w:rPr>
           </w:pPr>
-          <w:hyperlink w:anchor="_Toc241588107" w:history="1">
+          <w:hyperlink w:anchor="_Toc241589345" w:history="1">
             <w:r>
               <w:rPr>
                 <w:rStyle w:val="Hyperlink"/>
@@ -1658,7 +1658,7 @@
               <w:rPr>
                 <w:noProof/>
               </w:rPr>
-              <w:instrText xml:space="preserve"> PAGEREF _Toc241588107 \h </w:instrText>
+              <w:instrText xml:space="preserve"> PAGEREF _Toc241589345 \h </w:instrText>
             </w:r>
             <w:r>
               <w:rPr>
@@ -1701,7 +1701,7 @@
               <w14:ligatures w14:val="standardContextual"/>
             </w:rPr>
           </w:pPr>
-          <w:hyperlink w:anchor="_Toc241588108" w:history="1">
+          <w:hyperlink w:anchor="_Toc241589346" w:history="1">
             <w:r>
               <w:rPr>
                 <w:rStyle w:val="Hyperlink"/>
@@ -1743,7 +1743,7 @@
               <w:rPr>
                 <w:noProof/>
               </w:rPr>
-              <w:instrText xml:space="preserve"> PAGEREF _Toc241588108 \h </w:instrText>
+              <w:instrText xml:space="preserve"> PAGEREF _Toc241589346 \h </w:instrText>
             </w:r>
             <w:r>
               <w:rPr>
@@ -1786,7 +1786,7 @@
               <w14:ligatures w14:val="standardContextual"/>
             </w:rPr>
           </w:pPr>
-          <w:hyperlink w:anchor="_Toc241588109" w:history="1">
+          <w:hyperlink w:anchor="_Toc241589347" w:history="1">
             <w:r>
               <w:rPr>
                 <w:rStyle w:val="Hyperlink"/>
@@ -1828,7 +1828,7 @@
               <w:rPr>
                 <w:noProof/>
               </w:rPr>
-              <w:instrText xml:space="preserve"> PAGEREF _Toc241588109 \h </w:instrText>
+              <w:instrText xml:space="preserve"> PAGEREF _Toc241589347 \h </w:instrText>
             </w:r>
             <w:r>
               <w:rPr>
@@ -1871,7 +1871,7 @@
               <w14:ligatures w14:val="standardContextual"/>
             </w:rPr>
           </w:pPr>
-          <w:hyperlink w:anchor="_Toc241588110" w:history="1">
+          <w:hyperlink w:anchor="_Toc241589348" w:history="1">
             <w:r>
               <w:rPr>
                 <w:rStyle w:val="Hyperlink"/>
@@ -1913,7 +1913,7 @@
               <w:rPr>
                 <w:noProof/>
               </w:rPr>
-              <w:instrText xml:space="preserve"> PAGEREF _Toc241588110 \h </w:instrText>
+              <w:instrText xml:space="preserve"> PAGEREF _Toc241589348 \h </w:instrText>
             </w:r>
             <w:r>
               <w:rPr>
@@ -1956,7 +1956,7 @@
               <w14:ligatures w14:val="standardContextual"/>
             </w:rPr>
           </w:pPr>
-          <w:hyperlink w:anchor="_Toc241588111" w:history="1">
+          <w:hyperlink w:anchor="_Toc241589349" w:history="1">
             <w:r>
               <w:rPr>
                 <w:rStyle w:val="Hyperlink"/>
@@ -1998,7 +1998,7 @@
               <w:rPr>
                 <w:noProof/>
               </w:rPr>
-              <w:instrText xml:space="preserve"> PAGEREF _Toc241588111 \h </w:instrText>
+              <w:instrText xml:space="preserve"> PAGEREF _Toc241589349 \h </w:instrText>
             </w:r>
             <w:r>
               <w:rPr>
@@ -2041,7 +2041,7 @@
               <w14:ligatures w14:val="standardContextual"/>
             </w:rPr>
           </w:pPr>
-          <w:hyperlink w:anchor="_Toc241588112" w:history="1">
+          <w:hyperlink w:anchor="_Toc241589350" w:history="1">
             <w:r>
               <w:rPr>
                 <w:rStyle w:val="Hyperlink"/>
@@ -2083,7 +2083,7 @@
               <w:rPr>
                 <w:noProof/>
               </w:rPr>
-              <w:instrText xml:space="preserve"> PAGEREF _Toc241588112 \h </w:instrText>
+              <w:instrText xml:space="preserve"> PAGEREF _Toc241589350 \h </w:instrText>
             </w:r>
             <w:r>
               <w:rPr>
@@ -2126,7 +2126,7 @@
               <w14:ligatures w14:val="standardContextual"/>
             </w:rPr>
           </w:pPr>
-          <w:hyperlink w:anchor="_Toc241588113" w:history="1">
+          <w:hyperlink w:anchor="_Toc241589351" w:history="1">
             <w:r>
               <w:rPr>
                 <w:rStyle w:val="Hyperlink"/>
@@ -2168,7 +2168,7 @@
               <w:rPr>
                 <w:noProof/>
               </w:rPr>
-              <w:instrText xml:space="preserve"> PAGEREF _Toc241588113 \h </w:instrText>
+              <w:instrText xml:space="preserve"> PAGEREF _Toc241589351 \h </w:instrText>
             </w:r>
             <w:r>
               <w:rPr>
@@ -2211,7 +2211,7 @@
               <w14:ligatures w14:val="standardContextual"/>
             </w:rPr>
           </w:pPr>
-          <w:hyperlink w:anchor="_Toc241588114" w:history="1">
+          <w:hyperlink w:anchor="_Toc241589352" w:history="1">
             <w:r>
               <w:rPr>
                 <w:rStyle w:val="Hyperlink"/>
@@ -2253,7 +2253,7 @@
               <w:rPr>
                 <w:noProof/>
               </w:rPr>
-              <w:instrText xml:space="preserve"> PAGEREF _Toc241588114 \h </w:instrText>
+              <w:instrText xml:space="preserve"> PAGEREF _Toc241589352 \h </w:instrText>
             </w:r>
             <w:r>
               <w:rPr>
@@ -2296,7 +2296,7 @@
               <w14:ligatures w14:val="standardContextual"/>
             </w:rPr>
           </w:pPr>
-          <w:hyperlink w:anchor="_Toc241588115" w:history="1">
+          <w:hyperlink w:anchor="_Toc241589353" w:history="1">
             <w:r>
               <w:rPr>
                 <w:rStyle w:val="Hyperlink"/>
@@ -2338,7 +2338,7 @@
               <w:rPr>
                 <w:noProof/>
               </w:rPr>
-              <w:instrText xml:space="preserve"> PAGEREF _Toc241588115 \h </w:instrText>
+              <w:instrText xml:space="preserve"> PAGEREF _Toc241589353 \h </w:instrText>
             </w:r>
             <w:r>
               <w:rPr>
@@ -2381,7 +2381,7 @@
               <w14:ligatures w14:val="standardContextual"/>
             </w:rPr>
           </w:pPr>
-          <w:hyperlink w:anchor="_Toc241588116" w:history="1">
+          <w:hyperlink w:anchor="_Toc241589354" w:history="1">
             <w:r>
               <w:rPr>
                 <w:rStyle w:val="Hyperlink"/>
@@ -2423,7 +2423,7 @@
               <w:rPr>
                 <w:noProof/>
               </w:rPr>
-              <w:instrText xml:space="preserve"> PAGEREF _Toc241588116 \h </w:instrText>
+              <w:instrText xml:space="preserve"> PAGEREF _Toc241589354 \h </w:instrText>
             </w:r>
             <w:r>
               <w:rPr>
@@ -2466,7 +2466,7 @@
               <w14:ligatures w14:val="standardContextual"/>
             </w:rPr>
           </w:pPr>
-          <w:hyperlink w:anchor="_Toc241588117" w:history="1">
+          <w:hyperlink w:anchor="_Toc241589355" w:history="1">
             <w:r>
               <w:rPr>
                 <w:rStyle w:val="Hyperlink"/>
@@ -2508,7 +2508,7 @@
               <w:rPr>
                 <w:noProof/>
               </w:rPr>
-              <w:instrText xml:space="preserve"> PAGEREF _Toc241588117 \h </w:instrText>
+              <w:instrText xml:space="preserve"> PAGEREF _Toc241589355 \h </w:instrText>
             </w:r>
             <w:r>
               <w:rPr>
@@ -2525,7 +2525,7 @@
               <w:rPr>
                 <w:noProof/>
               </w:rPr>
-              <w:t>13</w:t>
+              <w:t>14</w:t>
             </w:r>
             <w:r>
               <w:rPr>
@@ -2551,7 +2551,7 @@
               <w14:ligatures w14:val="standardContextual"/>
             </w:rPr>
           </w:pPr>
-          <w:hyperlink w:anchor="_Toc241588118" w:history="1">
+          <w:hyperlink w:anchor="_Toc241589356" w:history="1">
             <w:r>
               <w:rPr>
                 <w:rStyle w:val="Hyperlink"/>
@@ -2593,7 +2593,7 @@
               <w:rPr>
                 <w:noProof/>
               </w:rPr>
-              <w:instrText xml:space="preserve"> PAGEREF _Toc241588118 \h </w:instrText>
+              <w:instrText xml:space="preserve"> PAGEREF _Toc241589356 \h </w:instrText>
             </w:r>
             <w:r>
               <w:rPr>
@@ -2610,7 +2610,7 @@
               <w:rPr>
                 <w:noProof/>
               </w:rPr>
-              <w:t>13</w:t>
+              <w:t>15</w:t>
             </w:r>
             <w:r>
               <w:rPr>
@@ -2636,7 +2636,7 @@
               <w14:ligatures w14:val="standardContextual"/>
             </w:rPr>
           </w:pPr>
-          <w:hyperlink w:anchor="_Toc241588119" w:history="1">
+          <w:hyperlink w:anchor="_Toc241589357" w:history="1">
             <w:r>
               <w:rPr>
                 <w:rStyle w:val="Hyperlink"/>
@@ -2678,7 +2678,7 @@
               <w:rPr>
                 <w:noProof/>
               </w:rPr>
-              <w:instrText xml:space="preserve"> PAGEREF _Toc241588119 \h </w:instrText>
+              <w:instrText xml:space="preserve"> PAGEREF _Toc241589357 \h </w:instrText>
             </w:r>
             <w:r>
               <w:rPr>
@@ -2695,7 +2695,7 @@
               <w:rPr>
                 <w:noProof/>
               </w:rPr>
-              <w:t>13</w:t>
+              <w:t>16</w:t>
             </w:r>
             <w:r>
               <w:rPr>
@@ -2721,7 +2721,7 @@
               <w14:ligatures w14:val="standardContextual"/>
             </w:rPr>
           </w:pPr>
-          <w:hyperlink w:anchor="_Toc241588120" w:history="1">
+          <w:hyperlink w:anchor="_Toc241589358" w:history="1">
             <w:r>
               <w:rPr>
                 <w:rStyle w:val="Hyperlink"/>
@@ -2763,7 +2763,7 @@
               <w:rPr>
                 <w:noProof/>
               </w:rPr>
-              <w:instrText xml:space="preserve"> PAGEREF _Toc241588120 \h </w:instrText>
+              <w:instrText xml:space="preserve"> PAGEREF _Toc241589358 \h </w:instrText>
             </w:r>
             <w:r>
               <w:rPr>
@@ -2780,7 +2780,7 @@
               <w:rPr>
                 <w:noProof/>
               </w:rPr>
-              <w:t>13</w:t>
+              <w:t>17</w:t>
             </w:r>
             <w:r>
               <w:rPr>
@@ -2806,7 +2806,7 @@
               <w14:ligatures w14:val="standardContextual"/>
             </w:rPr>
           </w:pPr>
-          <w:hyperlink w:anchor="_Toc241588121" w:history="1">
+          <w:hyperlink w:anchor="_Toc241589359" w:history="1">
             <w:r>
               <w:rPr>
                 <w:rStyle w:val="Hyperlink"/>
@@ -2848,7 +2848,7 @@
               <w:rPr>
                 <w:noProof/>
               </w:rPr>
-              <w:instrText xml:space="preserve"> PAGEREF _Toc241588121 \h </w:instrText>
+              <w:instrText xml:space="preserve"> PAGEREF _Toc241589359 \h </w:instrText>
             </w:r>
             <w:r>
               <w:rPr>
@@ -2865,7 +2865,7 @@
               <w:rPr>
                 <w:noProof/>
               </w:rPr>
-              <w:t>13</w:t>
+              <w:t>18</w:t>
             </w:r>
             <w:r>
               <w:rPr>
@@ -2891,7 +2891,7 @@
               <w14:ligatures w14:val="standardContextual"/>
             </w:rPr>
           </w:pPr>
-          <w:hyperlink w:anchor="_Toc241588122" w:history="1">
+          <w:hyperlink w:anchor="_Toc241589360" w:history="1">
             <w:r>
               <w:rPr>
                 <w:rStyle w:val="Hyperlink"/>
@@ -2933,7 +2933,7 @@
               <w:rPr>
                 <w:noProof/>
               </w:rPr>
-              <w:instrText xml:space="preserve"> PAGEREF _Toc241588122 \h </w:instrText>
+              <w:instrText xml:space="preserve"> PAGEREF _Toc241589360 \h </w:instrText>
             </w:r>
             <w:r>
               <w:rPr>
@@ -2950,7 +2950,7 @@
               <w:rPr>
                 <w:noProof/>
               </w:rPr>
-              <w:t>13</w:t>
+              <w:t>19</w:t>
             </w:r>
             <w:r>
               <w:rPr>
@@ -2976,7 +2976,7 @@
               <w14:ligatures w14:val="standardContextual"/>
             </w:rPr>
           </w:pPr>
-          <w:hyperlink w:anchor="_Toc241588123" w:history="1">
+          <w:hyperlink w:anchor="_Toc241589361" w:history="1">
             <w:r>
               <w:rPr>
                 <w:rStyle w:val="Hyperlink"/>
@@ -3018,7 +3018,7 @@
               <w:rPr>
                 <w:noProof/>
               </w:rPr>
-              <w:instrText xml:space="preserve"> PAGEREF _Toc241588123 \h </w:instrText>
+              <w:instrText xml:space="preserve"> PAGEREF _Toc241589361 \h </w:instrText>
             </w:r>
             <w:r>
               <w:rPr>
@@ -3035,7 +3035,7 @@
               <w:rPr>
                 <w:noProof/>
               </w:rPr>
-              <w:t>13</w:t>
+              <w:t>20</w:t>
             </w:r>
             <w:r>
               <w:rPr>
@@ -3061,7 +3061,7 @@
               <w14:ligatures w14:val="standardContextual"/>
             </w:rPr>
           </w:pPr>
-          <w:hyperlink w:anchor="_Toc241588124" w:history="1">
+          <w:hyperlink w:anchor="_Toc241589362" w:history="1">
             <w:r>
               <w:rPr>
                 <w:rStyle w:val="Hyperlink"/>
@@ -3103,7 +3103,7 @@
               <w:rPr>
                 <w:noProof/>
               </w:rPr>
-              <w:instrText xml:space="preserve"> PAGEREF _Toc241588124 \h </w:instrText>
+              <w:instrText xml:space="preserve"> PAGEREF _Toc241589362 \h </w:instrText>
             </w:r>
             <w:r>
               <w:rPr>
@@ -3120,7 +3120,7 @@
               <w:rPr>
                 <w:noProof/>
               </w:rPr>
-              <w:t>13</w:t>
+              <w:t>21</w:t>
             </w:r>
             <w:r>
               <w:rPr>
@@ -3146,7 +3146,7 @@
               <w14:ligatures w14:val="standardContextual"/>
             </w:rPr>
           </w:pPr>
-          <w:hyperlink w:anchor="_Toc241588125" w:history="1">
+          <w:hyperlink w:anchor="_Toc241589363" w:history="1">
             <w:r>
               <w:rPr>
                 <w:rStyle w:val="Hyperlink"/>
@@ -3188,7 +3188,7 @@
               <w:rPr>
                 <w:noProof/>
               </w:rPr>
-              <w:instrText xml:space="preserve"> PAGEREF _Toc241588125 \h </w:instrText>
+              <w:instrText xml:space="preserve"> PAGEREF _Toc241589363 \h </w:instrText>
             </w:r>
             <w:r>
               <w:rPr>
@@ -3205,7 +3205,7 @@
               <w:rPr>
                 <w:noProof/>
               </w:rPr>
-              <w:t>13</w:t>
+              <w:t>22</w:t>
             </w:r>
             <w:r>
               <w:rPr>
@@ -3231,7 +3231,7 @@
               <w14:ligatures w14:val="standardContextual"/>
             </w:rPr>
           </w:pPr>
-          <w:hyperlink w:anchor="_Toc241588126" w:history="1">
+          <w:hyperlink w:anchor="_Toc241589364" w:history="1">
             <w:r>
               <w:rPr>
                 <w:rStyle w:val="Hyperlink"/>
@@ -3273,7 +3273,7 @@
               <w:rPr>
                 <w:noProof/>
               </w:rPr>
-              <w:instrText xml:space="preserve"> PAGEREF _Toc241588126 \h </w:instrText>
+              <w:instrText xml:space="preserve"> PAGEREF _Toc241589364 \h </w:instrText>
             </w:r>
             <w:r>
               <w:rPr>
@@ -3290,7 +3290,7 @@
               <w:rPr>
                 <w:noProof/>
               </w:rPr>
-              <w:t>13</w:t>
+              <w:t>23</w:t>
             </w:r>
             <w:r>
               <w:rPr>
@@ -3316,7 +3316,7 @@
               <w14:ligatures w14:val="standardContextual"/>
             </w:rPr>
           </w:pPr>
-          <w:hyperlink w:anchor="_Toc241588127" w:history="1">
+          <w:hyperlink w:anchor="_Toc241589365" w:history="1">
             <w:r>
               <w:rPr>
                 <w:rStyle w:val="Hyperlink"/>
@@ -3358,7 +3358,7 @@
               <w:rPr>
                 <w:noProof/>
               </w:rPr>
-              <w:instrText xml:space="preserve"> PAGEREF _Toc241588127 \h </w:instrText>
+              <w:instrText xml:space="preserve"> PAGEREF _Toc241589365 \h </w:instrText>
             </w:r>
             <w:r>
               <w:rPr>
@@ -3375,7 +3375,7 @@
               <w:rPr>
                 <w:noProof/>
               </w:rPr>
-              <w:t>13</w:t>
+              <w:t>24</w:t>
             </w:r>
             <w:r>
               <w:rPr>
@@ -3401,7 +3401,7 @@
               <w14:ligatures w14:val="standardContextual"/>
             </w:rPr>
           </w:pPr>
-          <w:hyperlink w:anchor="_Toc241588128" w:history="1">
+          <w:hyperlink w:anchor="_Toc241589366" w:history="1">
             <w:r>
               <w:rPr>
                 <w:rStyle w:val="Hyperlink"/>
@@ -3443,7 +3443,7 @@
               <w:rPr>
                 <w:noProof/>
               </w:rPr>
-              <w:instrText xml:space="preserve"> PAGEREF _Toc241588128 \h </w:instrText>
+              <w:instrText xml:space="preserve"> PAGEREF _Toc241589366 \h </w:instrText>
             </w:r>
             <w:r>
               <w:rPr>
@@ -3460,7 +3460,7 @@
               <w:rPr>
                 <w:noProof/>
               </w:rPr>
-              <w:t>13</w:t>
+              <w:t>24</w:t>
             </w:r>
             <w:r>
               <w:rPr>
@@ -3486,7 +3486,7 @@
               <w14:ligatures w14:val="standardContextual"/>
             </w:rPr>
           </w:pPr>
-          <w:hyperlink w:anchor="_Toc241588129" w:history="1">
+          <w:hyperlink w:anchor="_Toc241589367" w:history="1">
             <w:r>
               <w:rPr>
                 <w:rStyle w:val="Hyperlink"/>
@@ -3528,7 +3528,7 @@
               <w:rPr>
                 <w:noProof/>
               </w:rPr>
-              <w:instrText xml:space="preserve"> PAGEREF _Toc241588129 \h </w:instrText>
+              <w:instrText xml:space="preserve"> PAGEREF _Toc241589367 \h </w:instrText>
             </w:r>
             <w:r>
               <w:rPr>
@@ -3545,7 +3545,7 @@
               <w:rPr>
                 <w:noProof/>
               </w:rPr>
-              <w:t>13</w:t>
+              <w:t>24</w:t>
             </w:r>
             <w:r>
               <w:rPr>
@@ -3571,7 +3571,7 @@
               <w14:ligatures w14:val="standardContextual"/>
             </w:rPr>
           </w:pPr>
-          <w:hyperlink w:anchor="_Toc241588130" w:history="1">
+          <w:hyperlink w:anchor="_Toc241589368" w:history="1">
             <w:r>
               <w:rPr>
                 <w:rStyle w:val="Hyperlink"/>
@@ -3613,7 +3613,7 @@
               <w:rPr>
                 <w:noProof/>
               </w:rPr>
-              <w:instrText xml:space="preserve"> PAGEREF _Toc241588130 \h </w:instrText>
+              <w:instrText xml:space="preserve"> PAGEREF _Toc241589368 \h </w:instrText>
             </w:r>
             <w:r>
               <w:rPr>
@@ -3630,7 +3630,7 @@
               <w:rPr>
                 <w:noProof/>
               </w:rPr>
-              <w:t>13</w:t>
+              <w:t>25</w:t>
             </w:r>
             <w:r>
               <w:rPr>
@@ -3656,7 +3656,7 @@
               <w14:ligatures w14:val="standardContextual"/>
             </w:rPr>
           </w:pPr>
-          <w:hyperlink w:anchor="_Toc241588131" w:history="1">
+          <w:hyperlink w:anchor="_Toc241589369" w:history="1">
             <w:r>
               <w:rPr>
                 <w:rStyle w:val="Hyperlink"/>
@@ -3698,7 +3698,7 @@
               <w:rPr>
                 <w:noProof/>
               </w:rPr>
-              <w:instrText xml:space="preserve"> PAGEREF _Toc241588131 \h </w:instrText>
+              <w:instrText xml:space="preserve"> PAGEREF _Toc241589369 \h </w:instrText>
             </w:r>
             <w:r>
               <w:rPr>
@@ -3715,7 +3715,7 @@
               <w:rPr>
                 <w:noProof/>
               </w:rPr>
-              <w:t>14</w:t>
+              <w:t>25</w:t>
             </w:r>
             <w:r>
               <w:rPr>
@@ -3741,7 +3741,7 @@
               <w14:ligatures w14:val="standardContextual"/>
             </w:rPr>
           </w:pPr>
-          <w:hyperlink w:anchor="_Toc241588132" w:history="1">
+          <w:hyperlink w:anchor="_Toc241589370" w:history="1">
             <w:r>
               <w:rPr>
                 <w:rStyle w:val="Hyperlink"/>
@@ -3783,7 +3783,7 @@
               <w:rPr>
                 <w:noProof/>
               </w:rPr>
-              <w:instrText xml:space="preserve"> PAGEREF _Toc241588132 \h </w:instrText>
+              <w:instrText xml:space="preserve"> PAGEREF _Toc241589370 \h </w:instrText>
             </w:r>
             <w:r>
               <w:rPr>
@@ -3800,7 +3800,7 @@
               <w:rPr>
                 <w:noProof/>
               </w:rPr>
-              <w:t>14</w:t>
+              <w:t>25</w:t>
             </w:r>
             <w:r>
               <w:rPr>
@@ -3826,7 +3826,7 @@
               <w14:ligatures w14:val="standardContextual"/>
             </w:rPr>
           </w:pPr>
-          <w:hyperlink w:anchor="_Toc241588133" w:history="1">
+          <w:hyperlink w:anchor="_Toc241589371" w:history="1">
             <w:r>
               <w:rPr>
                 <w:rStyle w:val="Hyperlink"/>
@@ -3868,7 +3868,7 @@
               <w:rPr>
                 <w:noProof/>
               </w:rPr>
-              <w:instrText xml:space="preserve"> PAGEREF _Toc241588133 \h </w:instrText>
+              <w:instrText xml:space="preserve"> PAGEREF _Toc241589371 \h </w:instrText>
             </w:r>
             <w:r>
               <w:rPr>
@@ -3885,7 +3885,7 @@
               <w:rPr>
                 <w:noProof/>
               </w:rPr>
-              <w:t>14</w:t>
+              <w:t>25</w:t>
             </w:r>
             <w:r>
               <w:rPr>
@@ -3911,7 +3911,7 @@
               <w14:ligatures w14:val="standardContextual"/>
             </w:rPr>
           </w:pPr>
-          <w:hyperlink w:anchor="_Toc241588134" w:history="1">
+          <w:hyperlink w:anchor="_Toc241589372" w:history="1">
             <w:r>
               <w:rPr>
                 <w:rStyle w:val="Hyperlink"/>
@@ -3953,7 +3953,7 @@
               <w:rPr>
                 <w:noProof/>
               </w:rPr>
-              <w:instrText xml:space="preserve"> PAGEREF _Toc241588134 \h </w:instrText>
+              <w:instrText xml:space="preserve"> PAGEREF _Toc241589372 \h </w:instrText>
             </w:r>
             <w:r>
               <w:rPr>
@@ -3970,7 +3970,7 @@
               <w:rPr>
                 <w:noProof/>
               </w:rPr>
-              <w:t>14</w:t>
+              <w:t>25</w:t>
             </w:r>
             <w:r>
               <w:rPr>
@@ -3996,7 +3996,7 @@
               <w14:ligatures w14:val="standardContextual"/>
             </w:rPr>
           </w:pPr>
-          <w:hyperlink w:anchor="_Toc241588135" w:history="1">
+          <w:hyperlink w:anchor="_Toc241589373" w:history="1">
             <w:r>
               <w:rPr>
                 <w:rStyle w:val="Hyperlink"/>
@@ -4038,7 +4038,7 @@
               <w:rPr>
                 <w:noProof/>
               </w:rPr>
-              <w:instrText xml:space="preserve"> PAGEREF _Toc241588135 \h </w:instrText>
+              <w:instrText xml:space="preserve"> PAGEREF _Toc241589373 \h </w:instrText>
             </w:r>
             <w:r>
               <w:rPr>
@@ -4055,7 +4055,7 @@
               <w:rPr>
                 <w:noProof/>
               </w:rPr>
-              <w:t>14</w:t>
+              <w:t>25</w:t>
             </w:r>
             <w:r>
               <w:rPr>
@@ -4081,7 +4081,7 @@
               <w14:ligatures w14:val="standardContextual"/>
             </w:rPr>
           </w:pPr>
-          <w:hyperlink w:anchor="_Toc241588136" w:history="1">
+          <w:hyperlink w:anchor="_Toc241589374" w:history="1">
             <w:r>
               <w:rPr>
                 <w:rStyle w:val="Hyperlink"/>
@@ -4123,7 +4123,7 @@
               <w:rPr>
                 <w:noProof/>
               </w:rPr>
-              <w:instrText xml:space="preserve"> PAGEREF _Toc241588136 \h </w:instrText>
+              <w:instrText xml:space="preserve"> PAGEREF _Toc241589374 \h </w:instrText>
             </w:r>
             <w:r>
               <w:rPr>
@@ -4140,7 +4140,7 @@
               <w:rPr>
                 <w:noProof/>
               </w:rPr>
-              <w:t>14</w:t>
+              <w:t>25</w:t>
             </w:r>
             <w:r>
               <w:rPr>
@@ -4166,7 +4166,7 @@
               <w14:ligatures w14:val="standardContextual"/>
             </w:rPr>
           </w:pPr>
-          <w:hyperlink w:anchor="_Toc241588137" w:history="1">
+          <w:hyperlink w:anchor="_Toc241589375" w:history="1">
             <w:r>
               <w:rPr>
                 <w:rStyle w:val="Hyperlink"/>
@@ -4208,7 +4208,7 @@
               <w:rPr>
                 <w:noProof/>
               </w:rPr>
-              <w:instrText xml:space="preserve"> PAGEREF _Toc241588137 \h </w:instrText>
+              <w:instrText xml:space="preserve"> PAGEREF _Toc241589375 \h </w:instrText>
             </w:r>
             <w:r>
               <w:rPr>
@@ -4225,7 +4225,7 @@
               <w:rPr>
                 <w:noProof/>
               </w:rPr>
-              <w:t>14</w:t>
+              <w:t>25</w:t>
             </w:r>
             <w:r>
               <w:rPr>
@@ -4251,7 +4251,7 @@
               <w14:ligatures w14:val="standardContextual"/>
             </w:rPr>
           </w:pPr>
-          <w:hyperlink w:anchor="_Toc241588138" w:history="1">
+          <w:hyperlink w:anchor="_Toc241589376" w:history="1">
             <w:r>
               <w:rPr>
                 <w:rStyle w:val="Hyperlink"/>
@@ -4293,7 +4293,7 @@
               <w:rPr>
                 <w:noProof/>
               </w:rPr>
-              <w:instrText xml:space="preserve"> PAGEREF _Toc241588138 \h </w:instrText>
+              <w:instrText xml:space="preserve"> PAGEREF _Toc241589376 \h </w:instrText>
             </w:r>
             <w:r>
               <w:rPr>
@@ -4310,7 +4310,7 @@
               <w:rPr>
                 <w:noProof/>
               </w:rPr>
-              <w:t>14</w:t>
+              <w:t>25</w:t>
             </w:r>
             <w:r>
               <w:rPr>
@@ -4336,7 +4336,7 @@
               <w14:ligatures w14:val="standardContextual"/>
             </w:rPr>
           </w:pPr>
-          <w:hyperlink w:anchor="_Toc241588139" w:history="1">
+          <w:hyperlink w:anchor="_Toc241589377" w:history="1">
             <w:r>
               <w:rPr>
                 <w:rStyle w:val="Hyperlink"/>
@@ -4378,7 +4378,7 @@
               <w:rPr>
                 <w:noProof/>
               </w:rPr>
-              <w:instrText xml:space="preserve"> PAGEREF _Toc241588139 \h </w:instrText>
+              <w:instrText xml:space="preserve"> PAGEREF _Toc241589377 \h </w:instrText>
             </w:r>
             <w:r>
               <w:rPr>
@@ -4395,7 +4395,7 @@
               <w:rPr>
                 <w:noProof/>
               </w:rPr>
-              <w:t>14</w:t>
+              <w:t>25</w:t>
             </w:r>
             <w:r>
               <w:rPr>
@@ -4421,7 +4421,7 @@
               <w14:ligatures w14:val="standardContextual"/>
             </w:rPr>
           </w:pPr>
-          <w:hyperlink w:anchor="_Toc241588140" w:history="1">
+          <w:hyperlink w:anchor="_Toc241589378" w:history="1">
             <w:r>
               <w:rPr>
                 <w:rStyle w:val="Hyperlink"/>
@@ -4463,7 +4463,7 @@
               <w:rPr>
                 <w:noProof/>
               </w:rPr>
-              <w:instrText xml:space="preserve"> PAGEREF _Toc241588140 \h </w:instrText>
+              <w:instrText xml:space="preserve"> PAGEREF _Toc241589378 \h </w:instrText>
             </w:r>
             <w:r>
               <w:rPr>
@@ -4480,7 +4480,7 @@
               <w:rPr>
                 <w:noProof/>
               </w:rPr>
-              <w:t>14</w:t>
+              <w:t>25</w:t>
             </w:r>
             <w:r>
               <w:rPr>
@@ -4506,7 +4506,7 @@
               <w14:ligatures w14:val="standardContextual"/>
             </w:rPr>
           </w:pPr>
-          <w:hyperlink w:anchor="_Toc241588141" w:history="1">
+          <w:hyperlink w:anchor="_Toc241589379" w:history="1">
             <w:r>
               <w:rPr>
                 <w:rStyle w:val="Hyperlink"/>
@@ -4548,7 +4548,7 @@
               <w:rPr>
                 <w:noProof/>
               </w:rPr>
-              <w:instrText xml:space="preserve"> PAGEREF _Toc241588141 \h </w:instrText>
+              <w:instrText xml:space="preserve"> PAGEREF _Toc241589379 \h </w:instrText>
             </w:r>
             <w:r>
               <w:rPr>
@@ -4565,7 +4565,7 @@
               <w:rPr>
                 <w:noProof/>
               </w:rPr>
-              <w:t>14</w:t>
+              <w:t>25</w:t>
             </w:r>
             <w:r>
               <w:rPr>
@@ -4591,7 +4591,7 @@
               <w14:ligatures w14:val="standardContextual"/>
             </w:rPr>
           </w:pPr>
-          <w:hyperlink w:anchor="_Toc241588142" w:history="1">
+          <w:hyperlink w:anchor="_Toc241589380" w:history="1">
             <w:r>
               <w:rPr>
                 <w:rStyle w:val="Hyperlink"/>
@@ -4633,7 +4633,7 @@
               <w:rPr>
                 <w:noProof/>
               </w:rPr>
-              <w:instrText xml:space="preserve"> PAGEREF _Toc241588142 \h </w:instrText>
+              <w:instrText xml:space="preserve"> PAGEREF _Toc241589380 \h </w:instrText>
             </w:r>
             <w:r>
               <w:rPr>
@@ -4650,7 +4650,7 @@
               <w:rPr>
                 <w:noProof/>
               </w:rPr>
-              <w:t>14</w:t>
+              <w:t>25</w:t>
             </w:r>
             <w:r>
               <w:rPr>
@@ -4676,7 +4676,7 @@
               <w14:ligatures w14:val="standardContextual"/>
             </w:rPr>
           </w:pPr>
-          <w:hyperlink w:anchor="_Toc241588143" w:history="1">
+          <w:hyperlink w:anchor="_Toc241589381" w:history="1">
             <w:r>
               <w:rPr>
                 <w:rStyle w:val="Hyperlink"/>
@@ -4718,7 +4718,7 @@
               <w:rPr>
                 <w:noProof/>
               </w:rPr>
-              <w:instrText xml:space="preserve"> PAGEREF _Toc241588143 \h </w:instrText>
+              <w:instrText xml:space="preserve"> PAGEREF _Toc241589381 \h </w:instrText>
             </w:r>
             <w:r>
               <w:rPr>
@@ -4735,7 +4735,7 @@
               <w:rPr>
                 <w:noProof/>
               </w:rPr>
-              <w:t>14</w:t>
+              <w:t>25</w:t>
             </w:r>
             <w:r>
               <w:rPr>
@@ -4761,7 +4761,7 @@
               <w14:ligatures w14:val="standardContextual"/>
             </w:rPr>
           </w:pPr>
-          <w:hyperlink w:anchor="_Toc241588144" w:history="1">
+          <w:hyperlink w:anchor="_Toc241589382" w:history="1">
             <w:r>
               <w:rPr>
                 <w:rStyle w:val="Hyperlink"/>
@@ -4803,7 +4803,7 @@
               <w:rPr>
                 <w:noProof/>
               </w:rPr>
-              <w:instrText xml:space="preserve"> PAGEREF _Toc241588144 \h </w:instrText>
+              <w:instrText xml:space="preserve"> PAGEREF _Toc241589382 \h </w:instrText>
             </w:r>
             <w:r>
               <w:rPr>
@@ -4820,7 +4820,7 @@
               <w:rPr>
                 <w:noProof/>
               </w:rPr>
-              <w:t>14</w:t>
+              <w:t>25</w:t>
             </w:r>
             <w:r>
               <w:rPr>
@@ -4846,7 +4846,7 @@
               <w14:ligatures w14:val="standardContextual"/>
             </w:rPr>
           </w:pPr>
-          <w:hyperlink w:anchor="_Toc241588145" w:history="1">
+          <w:hyperlink w:anchor="_Toc241589383" w:history="1">
             <w:r>
               <w:rPr>
                 <w:rStyle w:val="Hyperlink"/>
@@ -4888,7 +4888,7 @@
               <w:rPr>
                 <w:noProof/>
               </w:rPr>
-              <w:instrText xml:space="preserve"> PAGEREF _Toc241588145 \h </w:instrText>
+              <w:instrText xml:space="preserve"> PAGEREF _Toc241589383 \h </w:instrText>
             </w:r>
             <w:r>
               <w:rPr>
@@ -4905,7 +4905,7 @@
               <w:rPr>
                 <w:noProof/>
               </w:rPr>
-              <w:t>14</w:t>
+              <w:t>25</w:t>
             </w:r>
             <w:r>
               <w:rPr>
@@ -4931,7 +4931,7 @@
               <w14:ligatures w14:val="standardContextual"/>
             </w:rPr>
           </w:pPr>
-          <w:hyperlink w:anchor="_Toc241588146" w:history="1">
+          <w:hyperlink w:anchor="_Toc241589384" w:history="1">
             <w:r>
               <w:rPr>
                 <w:rStyle w:val="Hyperlink"/>
@@ -4973,7 +4973,7 @@
               <w:rPr>
                 <w:noProof/>
               </w:rPr>
-              <w:instrText xml:space="preserve"> PAGEREF _Toc241588146 \h </w:instrText>
+              <w:instrText xml:space="preserve"> PAGEREF _Toc241589384 \h </w:instrText>
             </w:r>
             <w:r>
               <w:rPr>
@@ -4990,7 +4990,7 @@
               <w:rPr>
                 <w:noProof/>
               </w:rPr>
-              <w:t>14</w:t>
+              <w:t>26</w:t>
             </w:r>
             <w:r>
               <w:rPr>
@@ -5016,7 +5016,7 @@
               <w14:ligatures w14:val="standardContextual"/>
             </w:rPr>
           </w:pPr>
-          <w:hyperlink w:anchor="_Toc241588147" w:history="1">
+          <w:hyperlink w:anchor="_Toc241589385" w:history="1">
             <w:r>
               <w:rPr>
                 <w:rStyle w:val="Hyperlink"/>
@@ -5058,7 +5058,7 @@
               <w:rPr>
                 <w:noProof/>
               </w:rPr>
-              <w:instrText xml:space="preserve"> PAGEREF _Toc241588147 \h </w:instrText>
+              <w:instrText xml:space="preserve"> PAGEREF _Toc241589385 \h </w:instrText>
             </w:r>
             <w:r>
               <w:rPr>
@@ -5075,7 +5075,7 @@
               <w:rPr>
                 <w:noProof/>
               </w:rPr>
-              <w:t>15</w:t>
+              <w:t>26</w:t>
             </w:r>
             <w:r>
               <w:rPr>
@@ -5101,7 +5101,7 @@
               <w14:ligatures w14:val="standardContextual"/>
             </w:rPr>
           </w:pPr>
-          <w:hyperlink w:anchor="_Toc241588148" w:history="1">
+          <w:hyperlink w:anchor="_Toc241589386" w:history="1">
             <w:r>
               <w:rPr>
                 <w:rStyle w:val="Hyperlink"/>
@@ -5143,7 +5143,7 @@
               <w:rPr>
                 <w:noProof/>
               </w:rPr>
-              <w:instrText xml:space="preserve"> PAGEREF _Toc241588148 \h </w:instrText>
+              <w:instrText xml:space="preserve"> PAGEREF _Toc241589386 \h </w:instrText>
             </w:r>
             <w:r>
               <w:rPr>
@@ -5160,7 +5160,7 @@
               <w:rPr>
                 <w:noProof/>
               </w:rPr>
-              <w:t>15</w:t>
+              <w:t>26</w:t>
             </w:r>
             <w:r>
               <w:rPr>
@@ -5186,7 +5186,7 @@
               <w14:ligatures w14:val="standardContextual"/>
             </w:rPr>
           </w:pPr>
-          <w:hyperlink w:anchor="_Toc241588149" w:history="1">
+          <w:hyperlink w:anchor="_Toc241589387" w:history="1">
             <w:r>
               <w:rPr>
                 <w:rStyle w:val="Hyperlink"/>
@@ -5228,7 +5228,7 @@
               <w:rPr>
                 <w:noProof/>
               </w:rPr>
-              <w:instrText xml:space="preserve"> PAGEREF _Toc241588149 \h </w:instrText>
+              <w:instrText xml:space="preserve"> PAGEREF _Toc241589387 \h </w:instrText>
             </w:r>
             <w:r>
               <w:rPr>
@@ -5245,7 +5245,7 @@
               <w:rPr>
                 <w:noProof/>
               </w:rPr>
-              <w:t>15</w:t>
+              <w:t>26</w:t>
             </w:r>
             <w:r>
               <w:rPr>
@@ -5271,7 +5271,7 @@
               <w14:ligatures w14:val="standardContextual"/>
             </w:rPr>
           </w:pPr>
-          <w:hyperlink w:anchor="_Toc241588150" w:history="1">
+          <w:hyperlink w:anchor="_Toc241589388" w:history="1">
             <w:r>
               <w:rPr>
                 <w:rStyle w:val="Hyperlink"/>
@@ -5313,7 +5313,7 @@
               <w:rPr>
                 <w:noProof/>
               </w:rPr>
-              <w:instrText xml:space="preserve"> PAGEREF _Toc241588150 \h </w:instrText>
+              <w:instrText xml:space="preserve"> PAGEREF _Toc241589388 \h </w:instrText>
             </w:r>
             <w:r>
               <w:rPr>
@@ -5330,7 +5330,7 @@
               <w:rPr>
                 <w:noProof/>
               </w:rPr>
-              <w:t>15</w:t>
+              <w:t>26</w:t>
             </w:r>
             <w:r>
               <w:rPr>
@@ -5355,7 +5355,7 @@
               <w14:ligatures w14:val="standardContextual"/>
             </w:rPr>
           </w:pPr>
-          <w:hyperlink w:anchor="_Toc241588151" w:history="1">
+          <w:hyperlink w:anchor="_Toc241589389" w:history="1">
             <w:r>
               <w:rPr>
                 <w:rStyle w:val="Hyperlink"/>
@@ -5379,7 +5379,7 @@
               <w:rPr>
                 <w:noProof/>
               </w:rPr>
-              <w:instrText xml:space="preserve"> PAGEREF _Toc241588151 \h </w:instrText>
+              <w:instrText xml:space="preserve"> PAGEREF _Toc241589389 \h </w:instrText>
             </w:r>
             <w:r>
               <w:rPr>
@@ -5396,7 +5396,7 @@
               <w:rPr>
                 <w:noProof/>
               </w:rPr>
-              <w:t>16</w:t>
+              <w:t>27</w:t>
             </w:r>
             <w:r>
               <w:rPr>
@@ -5437,11 +5437,25 @@
     <w:sdt>
       <w:sdtPr>
         <w:alias w:val="Daftar Gambar"/>
-        <w:id w:val="-116999367"/>
+        <w:id w:val="892089182"/>
       </w:sdtPr>
       <w:sdtEndPr/>
       <w:sdtContent>
         <w:p>
+          <w:pPr>
+            <w:pStyle w:val="TableofFigures"/>
+            <w:tabs>
+              <w:tab w:val="right" w:leader="dot" w:pos="9016"/>
+            </w:tabs>
+            <w:rPr>
+              <w:rFonts w:asciiTheme="minorHAnsi" w:eastAsiaTheme="minorEastAsia" w:hAnsiTheme="minorHAnsi" w:cstheme="minorBidi"/>
+              <w:noProof/>
+              <w:kern w:val="2"/>
+              <w:sz w:val="24"/>
+              <w:szCs w:val="24"/>
+              <w14:ligatures w14:val="standardContextual"/>
+            </w:rPr>
+          </w:pPr>
           <w:r>
             <w:fldChar w:fldCharType="begin"/>
           </w:r>
@@ -5451,15 +5465,784 @@
           <w:r>
             <w:fldChar w:fldCharType="separate"/>
           </w:r>
-          <w:r>
+          <w:hyperlink w:anchor="_Toc241589390" w:history="1">
+            <w:r>
+              <w:rPr>
+                <w:rStyle w:val="Hyperlink"/>
+                <w:noProof/>
+              </w:rPr>
+              <w:t>FIG- 1 FBPMNRegistrasi</w:t>
+            </w:r>
+            <w:r>
+              <w:rPr>
+                <w:noProof/>
+              </w:rPr>
+              <w:tab/>
+            </w:r>
+            <w:r>
+              <w:rPr>
+                <w:noProof/>
+              </w:rPr>
+              <w:fldChar w:fldCharType="begin"/>
+            </w:r>
+            <w:r>
+              <w:rPr>
+                <w:noProof/>
+              </w:rPr>
+              <w:instrText xml:space="preserve"> PAGEREF _Toc241589390 \h </w:instrText>
+            </w:r>
+            <w:r>
+              <w:rPr>
+                <w:noProof/>
+              </w:rPr>
+            </w:r>
+            <w:r>
+              <w:rPr>
+                <w:noProof/>
+              </w:rPr>
+              <w:fldChar w:fldCharType="separate"/>
+            </w:r>
+            <w:r>
+              <w:rPr>
+                <w:noProof/>
+              </w:rPr>
+              <w:t>13</w:t>
+            </w:r>
+            <w:r>
+              <w:rPr>
+                <w:noProof/>
+              </w:rPr>
+              <w:fldChar w:fldCharType="end"/>
+            </w:r>
+          </w:hyperlink>
+        </w:p>
+        <w:p>
+          <w:pPr>
+            <w:pStyle w:val="TableofFigures"/>
+            <w:tabs>
+              <w:tab w:val="right" w:leader="dot" w:pos="9016"/>
+            </w:tabs>
             <w:rPr>
-              <w:b/>
-              <w:bCs/>
+              <w:rFonts w:asciiTheme="minorHAnsi" w:eastAsiaTheme="minorEastAsia" w:hAnsiTheme="minorHAnsi" w:cstheme="minorBidi"/>
               <w:noProof/>
-              <w:lang w:val="en-US"/>
+              <w:kern w:val="2"/>
+              <w:sz w:val="24"/>
+              <w:szCs w:val="24"/>
+              <w14:ligatures w14:val="standardContextual"/>
             </w:rPr>
-            <w:t>No table of figures entries found.</w:t>
-          </w:r>
+          </w:pPr>
+          <w:hyperlink w:anchor="_Toc241589391" w:history="1">
+            <w:r>
+              <w:rPr>
+                <w:rStyle w:val="Hyperlink"/>
+                <w:noProof/>
+              </w:rPr>
+              <w:t>FIG- 2 FBPMNLogin</w:t>
+            </w:r>
+            <w:r>
+              <w:rPr>
+                <w:noProof/>
+              </w:rPr>
+              <w:tab/>
+            </w:r>
+            <w:r>
+              <w:rPr>
+                <w:noProof/>
+              </w:rPr>
+              <w:fldChar w:fldCharType="begin"/>
+            </w:r>
+            <w:r>
+              <w:rPr>
+                <w:noProof/>
+              </w:rPr>
+              <w:instrText xml:space="preserve"> PAGEREF _Toc241589391 \h </w:instrText>
+            </w:r>
+            <w:r>
+              <w:rPr>
+                <w:noProof/>
+              </w:rPr>
+            </w:r>
+            <w:r>
+              <w:rPr>
+                <w:noProof/>
+              </w:rPr>
+              <w:fldChar w:fldCharType="separate"/>
+            </w:r>
+            <w:r>
+              <w:rPr>
+                <w:noProof/>
+              </w:rPr>
+              <w:t>14</w:t>
+            </w:r>
+            <w:r>
+              <w:rPr>
+                <w:noProof/>
+              </w:rPr>
+              <w:fldChar w:fldCharType="end"/>
+            </w:r>
+          </w:hyperlink>
+        </w:p>
+        <w:p>
+          <w:pPr>
+            <w:pStyle w:val="TableofFigures"/>
+            <w:tabs>
+              <w:tab w:val="right" w:leader="dot" w:pos="9016"/>
+            </w:tabs>
+            <w:rPr>
+              <w:rFonts w:asciiTheme="minorHAnsi" w:eastAsiaTheme="minorEastAsia" w:hAnsiTheme="minorHAnsi" w:cstheme="minorBidi"/>
+              <w:noProof/>
+              <w:kern w:val="2"/>
+              <w:sz w:val="24"/>
+              <w:szCs w:val="24"/>
+              <w14:ligatures w14:val="standardContextual"/>
+            </w:rPr>
+          </w:pPr>
+          <w:hyperlink w:anchor="_Toc241589392" w:history="1">
+            <w:r>
+              <w:rPr>
+                <w:rStyle w:val="Hyperlink"/>
+                <w:noProof/>
+              </w:rPr>
+              <w:t>FIG- 3 FBPMNPilihGameProduk</w:t>
+            </w:r>
+            <w:r>
+              <w:rPr>
+                <w:noProof/>
+              </w:rPr>
+              <w:tab/>
+            </w:r>
+            <w:r>
+              <w:rPr>
+                <w:noProof/>
+              </w:rPr>
+              <w:fldChar w:fldCharType="begin"/>
+            </w:r>
+            <w:r>
+              <w:rPr>
+                <w:noProof/>
+              </w:rPr>
+              <w:instrText xml:space="preserve"> PAGEREF _Toc241589392 \h </w:instrText>
+            </w:r>
+            <w:r>
+              <w:rPr>
+                <w:noProof/>
+              </w:rPr>
+            </w:r>
+            <w:r>
+              <w:rPr>
+                <w:noProof/>
+              </w:rPr>
+              <w:fldChar w:fldCharType="separate"/>
+            </w:r>
+            <w:r>
+              <w:rPr>
+                <w:noProof/>
+              </w:rPr>
+              <w:t>15</w:t>
+            </w:r>
+            <w:r>
+              <w:rPr>
+                <w:noProof/>
+              </w:rPr>
+              <w:fldChar w:fldCharType="end"/>
+            </w:r>
+          </w:hyperlink>
+        </w:p>
+        <w:p>
+          <w:pPr>
+            <w:pStyle w:val="TableofFigures"/>
+            <w:tabs>
+              <w:tab w:val="right" w:leader="dot" w:pos="9016"/>
+            </w:tabs>
+            <w:rPr>
+              <w:rFonts w:asciiTheme="minorHAnsi" w:eastAsiaTheme="minorEastAsia" w:hAnsiTheme="minorHAnsi" w:cstheme="minorBidi"/>
+              <w:noProof/>
+              <w:kern w:val="2"/>
+              <w:sz w:val="24"/>
+              <w:szCs w:val="24"/>
+              <w14:ligatures w14:val="standardContextual"/>
+            </w:rPr>
+          </w:pPr>
+          <w:hyperlink w:anchor="_Toc241589393" w:history="1">
+            <w:r>
+              <w:rPr>
+                <w:rStyle w:val="Hyperlink"/>
+                <w:noProof/>
+              </w:rPr>
+              <w:t>FIG- 4 FBPMNTransaksiTopUp</w:t>
+            </w:r>
+            <w:r>
+              <w:rPr>
+                <w:noProof/>
+              </w:rPr>
+              <w:tab/>
+            </w:r>
+            <w:r>
+              <w:rPr>
+                <w:noProof/>
+              </w:rPr>
+              <w:fldChar w:fldCharType="begin"/>
+            </w:r>
+            <w:r>
+              <w:rPr>
+                <w:noProof/>
+              </w:rPr>
+              <w:instrText xml:space="preserve"> PAGEREF _Toc241589393 \h </w:instrText>
+            </w:r>
+            <w:r>
+              <w:rPr>
+                <w:noProof/>
+              </w:rPr>
+            </w:r>
+            <w:r>
+              <w:rPr>
+                <w:noProof/>
+              </w:rPr>
+              <w:fldChar w:fldCharType="separate"/>
+            </w:r>
+            <w:r>
+              <w:rPr>
+                <w:noProof/>
+              </w:rPr>
+              <w:t>16</w:t>
+            </w:r>
+            <w:r>
+              <w:rPr>
+                <w:noProof/>
+              </w:rPr>
+              <w:fldChar w:fldCharType="end"/>
+            </w:r>
+          </w:hyperlink>
+        </w:p>
+        <w:p>
+          <w:pPr>
+            <w:pStyle w:val="TableofFigures"/>
+            <w:tabs>
+              <w:tab w:val="right" w:leader="dot" w:pos="9016"/>
+            </w:tabs>
+            <w:rPr>
+              <w:rFonts w:asciiTheme="minorHAnsi" w:eastAsiaTheme="minorEastAsia" w:hAnsiTheme="minorHAnsi" w:cstheme="minorBidi"/>
+              <w:noProof/>
+              <w:kern w:val="2"/>
+              <w:sz w:val="24"/>
+              <w:szCs w:val="24"/>
+              <w14:ligatures w14:val="standardContextual"/>
+            </w:rPr>
+          </w:pPr>
+          <w:hyperlink w:anchor="_Toc241589394" w:history="1">
+            <w:r>
+              <w:rPr>
+                <w:rStyle w:val="Hyperlink"/>
+                <w:noProof/>
+              </w:rPr>
+              <w:t>FIG- 5 FBPMNKodePromo</w:t>
+            </w:r>
+            <w:r>
+              <w:rPr>
+                <w:noProof/>
+              </w:rPr>
+              <w:tab/>
+            </w:r>
+            <w:r>
+              <w:rPr>
+                <w:noProof/>
+              </w:rPr>
+              <w:fldChar w:fldCharType="begin"/>
+            </w:r>
+            <w:r>
+              <w:rPr>
+                <w:noProof/>
+              </w:rPr>
+              <w:instrText xml:space="preserve"> PAGEREF _Toc241589394 \h </w:instrText>
+            </w:r>
+            <w:r>
+              <w:rPr>
+                <w:noProof/>
+              </w:rPr>
+            </w:r>
+            <w:r>
+              <w:rPr>
+                <w:noProof/>
+              </w:rPr>
+              <w:fldChar w:fldCharType="separate"/>
+            </w:r>
+            <w:r>
+              <w:rPr>
+                <w:noProof/>
+              </w:rPr>
+              <w:t>17</w:t>
+            </w:r>
+            <w:r>
+              <w:rPr>
+                <w:noProof/>
+              </w:rPr>
+              <w:fldChar w:fldCharType="end"/>
+            </w:r>
+          </w:hyperlink>
+        </w:p>
+        <w:p>
+          <w:pPr>
+            <w:pStyle w:val="TableofFigures"/>
+            <w:tabs>
+              <w:tab w:val="right" w:leader="dot" w:pos="9016"/>
+            </w:tabs>
+            <w:rPr>
+              <w:rFonts w:asciiTheme="minorHAnsi" w:eastAsiaTheme="minorEastAsia" w:hAnsiTheme="minorHAnsi" w:cstheme="minorBidi"/>
+              <w:noProof/>
+              <w:kern w:val="2"/>
+              <w:sz w:val="24"/>
+              <w:szCs w:val="24"/>
+              <w14:ligatures w14:val="standardContextual"/>
+            </w:rPr>
+          </w:pPr>
+          <w:hyperlink w:anchor="_Toc241589395" w:history="1">
+            <w:r>
+              <w:rPr>
+                <w:rStyle w:val="Hyperlink"/>
+                <w:noProof/>
+              </w:rPr>
+              <w:t>FIG- 6 FBPMNPembayaranMidtrans</w:t>
+            </w:r>
+            <w:r>
+              <w:rPr>
+                <w:noProof/>
+              </w:rPr>
+              <w:tab/>
+            </w:r>
+            <w:r>
+              <w:rPr>
+                <w:noProof/>
+              </w:rPr>
+              <w:fldChar w:fldCharType="begin"/>
+            </w:r>
+            <w:r>
+              <w:rPr>
+                <w:noProof/>
+              </w:rPr>
+              <w:instrText xml:space="preserve"> PAGEREF _Toc241589395 \h </w:instrText>
+            </w:r>
+            <w:r>
+              <w:rPr>
+                <w:noProof/>
+              </w:rPr>
+            </w:r>
+            <w:r>
+              <w:rPr>
+                <w:noProof/>
+              </w:rPr>
+              <w:fldChar w:fldCharType="separate"/>
+            </w:r>
+            <w:r>
+              <w:rPr>
+                <w:noProof/>
+              </w:rPr>
+              <w:t>18</w:t>
+            </w:r>
+            <w:r>
+              <w:rPr>
+                <w:noProof/>
+              </w:rPr>
+              <w:fldChar w:fldCharType="end"/>
+            </w:r>
+          </w:hyperlink>
+        </w:p>
+        <w:p>
+          <w:pPr>
+            <w:pStyle w:val="TableofFigures"/>
+            <w:tabs>
+              <w:tab w:val="right" w:leader="dot" w:pos="9016"/>
+            </w:tabs>
+            <w:rPr>
+              <w:rFonts w:asciiTheme="minorHAnsi" w:eastAsiaTheme="minorEastAsia" w:hAnsiTheme="minorHAnsi" w:cstheme="minorBidi"/>
+              <w:noProof/>
+              <w:kern w:val="2"/>
+              <w:sz w:val="24"/>
+              <w:szCs w:val="24"/>
+              <w14:ligatures w14:val="standardContextual"/>
+            </w:rPr>
+          </w:pPr>
+          <w:hyperlink w:anchor="_Toc241589396" w:history="1">
+            <w:r>
+              <w:rPr>
+                <w:rStyle w:val="Hyperlink"/>
+                <w:noProof/>
+              </w:rPr>
+              <w:t>FIG- 7 FBPMNPengisianBalance</w:t>
+            </w:r>
+            <w:r>
+              <w:rPr>
+                <w:noProof/>
+              </w:rPr>
+              <w:tab/>
+            </w:r>
+            <w:r>
+              <w:rPr>
+                <w:noProof/>
+              </w:rPr>
+              <w:fldChar w:fldCharType="begin"/>
+            </w:r>
+            <w:r>
+              <w:rPr>
+                <w:noProof/>
+              </w:rPr>
+              <w:instrText xml:space="preserve"> PAGEREF _Toc241589396 \h </w:instrText>
+            </w:r>
+            <w:r>
+              <w:rPr>
+                <w:noProof/>
+              </w:rPr>
+            </w:r>
+            <w:r>
+              <w:rPr>
+                <w:noProof/>
+              </w:rPr>
+              <w:fldChar w:fldCharType="separate"/>
+            </w:r>
+            <w:r>
+              <w:rPr>
+                <w:noProof/>
+              </w:rPr>
+              <w:t>19</w:t>
+            </w:r>
+            <w:r>
+              <w:rPr>
+                <w:noProof/>
+              </w:rPr>
+              <w:fldChar w:fldCharType="end"/>
+            </w:r>
+          </w:hyperlink>
+        </w:p>
+        <w:p>
+          <w:pPr>
+            <w:pStyle w:val="TableofFigures"/>
+            <w:tabs>
+              <w:tab w:val="right" w:leader="dot" w:pos="9016"/>
+            </w:tabs>
+            <w:rPr>
+              <w:rFonts w:asciiTheme="minorHAnsi" w:eastAsiaTheme="minorEastAsia" w:hAnsiTheme="minorHAnsi" w:cstheme="minorBidi"/>
+              <w:noProof/>
+              <w:kern w:val="2"/>
+              <w:sz w:val="24"/>
+              <w:szCs w:val="24"/>
+              <w14:ligatures w14:val="standardContextual"/>
+            </w:rPr>
+          </w:pPr>
+          <w:hyperlink w:anchor="_Toc241589397" w:history="1">
+            <w:r>
+              <w:rPr>
+                <w:rStyle w:val="Hyperlink"/>
+                <w:noProof/>
+              </w:rPr>
+              <w:t>FIG- 8 FBPMNBayarBalance</w:t>
+            </w:r>
+            <w:r>
+              <w:rPr>
+                <w:noProof/>
+              </w:rPr>
+              <w:tab/>
+            </w:r>
+            <w:r>
+              <w:rPr>
+                <w:noProof/>
+              </w:rPr>
+              <w:fldChar w:fldCharType="begin"/>
+            </w:r>
+            <w:r>
+              <w:rPr>
+                <w:noProof/>
+              </w:rPr>
+              <w:instrText xml:space="preserve"> PAGEREF _Toc241589397 \h </w:instrText>
+            </w:r>
+            <w:r>
+              <w:rPr>
+                <w:noProof/>
+              </w:rPr>
+            </w:r>
+            <w:r>
+              <w:rPr>
+                <w:noProof/>
+              </w:rPr>
+              <w:fldChar w:fldCharType="separate"/>
+            </w:r>
+            <w:r>
+              <w:rPr>
+                <w:noProof/>
+              </w:rPr>
+              <w:t>20</w:t>
+            </w:r>
+            <w:r>
+              <w:rPr>
+                <w:noProof/>
+              </w:rPr>
+              <w:fldChar w:fldCharType="end"/>
+            </w:r>
+          </w:hyperlink>
+        </w:p>
+        <w:p>
+          <w:pPr>
+            <w:pStyle w:val="TableofFigures"/>
+            <w:tabs>
+              <w:tab w:val="right" w:leader="dot" w:pos="9016"/>
+            </w:tabs>
+            <w:rPr>
+              <w:rFonts w:asciiTheme="minorHAnsi" w:eastAsiaTheme="minorEastAsia" w:hAnsiTheme="minorHAnsi" w:cstheme="minorBidi"/>
+              <w:noProof/>
+              <w:kern w:val="2"/>
+              <w:sz w:val="24"/>
+              <w:szCs w:val="24"/>
+              <w14:ligatures w14:val="standardContextual"/>
+            </w:rPr>
+          </w:pPr>
+          <w:hyperlink w:anchor="_Toc241589398" w:history="1">
+            <w:r>
+              <w:rPr>
+                <w:rStyle w:val="Hyperlink"/>
+                <w:noProof/>
+              </w:rPr>
+              <w:t>FIG- 9 FBPMNCekInvoice</w:t>
+            </w:r>
+            <w:r>
+              <w:rPr>
+                <w:noProof/>
+              </w:rPr>
+              <w:tab/>
+            </w:r>
+            <w:r>
+              <w:rPr>
+                <w:noProof/>
+              </w:rPr>
+              <w:fldChar w:fldCharType="begin"/>
+            </w:r>
+            <w:r>
+              <w:rPr>
+                <w:noProof/>
+              </w:rPr>
+              <w:instrText xml:space="preserve"> PAGEREF _Toc241589398 \h </w:instrText>
+            </w:r>
+            <w:r>
+              <w:rPr>
+                <w:noProof/>
+              </w:rPr>
+            </w:r>
+            <w:r>
+              <w:rPr>
+                <w:noProof/>
+              </w:rPr>
+              <w:fldChar w:fldCharType="separate"/>
+            </w:r>
+            <w:r>
+              <w:rPr>
+                <w:noProof/>
+              </w:rPr>
+              <w:t>21</w:t>
+            </w:r>
+            <w:r>
+              <w:rPr>
+                <w:noProof/>
+              </w:rPr>
+              <w:fldChar w:fldCharType="end"/>
+            </w:r>
+          </w:hyperlink>
+        </w:p>
+        <w:p>
+          <w:pPr>
+            <w:pStyle w:val="TableofFigures"/>
+            <w:tabs>
+              <w:tab w:val="right" w:leader="dot" w:pos="9016"/>
+            </w:tabs>
+            <w:rPr>
+              <w:rFonts w:asciiTheme="minorHAnsi" w:eastAsiaTheme="minorEastAsia" w:hAnsiTheme="minorHAnsi" w:cstheme="minorBidi"/>
+              <w:noProof/>
+              <w:kern w:val="2"/>
+              <w:sz w:val="24"/>
+              <w:szCs w:val="24"/>
+              <w14:ligatures w14:val="standardContextual"/>
+            </w:rPr>
+          </w:pPr>
+          <w:hyperlink w:anchor="_Toc241589399" w:history="1">
+            <w:r>
+              <w:rPr>
+                <w:rStyle w:val="Hyperlink"/>
+                <w:noProof/>
+              </w:rPr>
+              <w:t>FIG- 10 FBPMNProfilRiwayat</w:t>
+            </w:r>
+            <w:r>
+              <w:rPr>
+                <w:noProof/>
+              </w:rPr>
+              <w:tab/>
+            </w:r>
+            <w:r>
+              <w:rPr>
+                <w:noProof/>
+              </w:rPr>
+              <w:fldChar w:fldCharType="begin"/>
+            </w:r>
+            <w:r>
+              <w:rPr>
+                <w:noProof/>
+              </w:rPr>
+              <w:instrText xml:space="preserve"> PAGEREF _Toc241589399 \h </w:instrText>
+            </w:r>
+            <w:r>
+              <w:rPr>
+                <w:noProof/>
+              </w:rPr>
+            </w:r>
+            <w:r>
+              <w:rPr>
+                <w:noProof/>
+              </w:rPr>
+              <w:fldChar w:fldCharType="separate"/>
+            </w:r>
+            <w:r>
+              <w:rPr>
+                <w:noProof/>
+              </w:rPr>
+              <w:t>22</w:t>
+            </w:r>
+            <w:r>
+              <w:rPr>
+                <w:noProof/>
+              </w:rPr>
+              <w:fldChar w:fldCharType="end"/>
+            </w:r>
+          </w:hyperlink>
+        </w:p>
+        <w:p>
+          <w:pPr>
+            <w:pStyle w:val="TableofFigures"/>
+            <w:tabs>
+              <w:tab w:val="right" w:leader="dot" w:pos="9016"/>
+            </w:tabs>
+            <w:rPr>
+              <w:rFonts w:asciiTheme="minorHAnsi" w:eastAsiaTheme="minorEastAsia" w:hAnsiTheme="minorHAnsi" w:cstheme="minorBidi"/>
+              <w:noProof/>
+              <w:kern w:val="2"/>
+              <w:sz w:val="24"/>
+              <w:szCs w:val="24"/>
+              <w14:ligatures w14:val="standardContextual"/>
+            </w:rPr>
+          </w:pPr>
+          <w:hyperlink w:anchor="_Toc241589400" w:history="1">
+            <w:r>
+              <w:rPr>
+                <w:rStyle w:val="Hyperlink"/>
+                <w:noProof/>
+              </w:rPr>
+              <w:t>FIG- 11 FBPMNMutasiBalance</w:t>
+            </w:r>
+            <w:r>
+              <w:rPr>
+                <w:noProof/>
+              </w:rPr>
+              <w:tab/>
+            </w:r>
+            <w:r>
+              <w:rPr>
+                <w:noProof/>
+              </w:rPr>
+              <w:fldChar w:fldCharType="begin"/>
+            </w:r>
+            <w:r>
+              <w:rPr>
+                <w:noProof/>
+              </w:rPr>
+              <w:instrText xml:space="preserve"> PAGEREF _Toc241589400 \h </w:instrText>
+            </w:r>
+            <w:r>
+              <w:rPr>
+                <w:noProof/>
+              </w:rPr>
+            </w:r>
+            <w:r>
+              <w:rPr>
+                <w:noProof/>
+              </w:rPr>
+              <w:fldChar w:fldCharType="separate"/>
+            </w:r>
+            <w:r>
+              <w:rPr>
+                <w:noProof/>
+              </w:rPr>
+              <w:t>23</w:t>
+            </w:r>
+            <w:r>
+              <w:rPr>
+                <w:noProof/>
+              </w:rPr>
+              <w:fldChar w:fldCharType="end"/>
+            </w:r>
+          </w:hyperlink>
+        </w:p>
+        <w:p>
+          <w:pPr>
+            <w:pStyle w:val="TableofFigures"/>
+            <w:tabs>
+              <w:tab w:val="right" w:leader="dot" w:pos="9016"/>
+            </w:tabs>
+            <w:rPr>
+              <w:rFonts w:asciiTheme="minorHAnsi" w:eastAsiaTheme="minorEastAsia" w:hAnsiTheme="minorHAnsi" w:cstheme="minorBidi"/>
+              <w:noProof/>
+              <w:kern w:val="2"/>
+              <w:sz w:val="24"/>
+              <w:szCs w:val="24"/>
+              <w14:ligatures w14:val="standardContextual"/>
+            </w:rPr>
+          </w:pPr>
+          <w:hyperlink w:anchor="_Toc241589401" w:history="1">
+            <w:r>
+              <w:rPr>
+                <w:rStyle w:val="Hyperlink"/>
+                <w:noProof/>
+              </w:rPr>
+              <w:t>FIG- 12 FBPMNLaporanAnalitik</w:t>
+            </w:r>
+            <w:r>
+              <w:rPr>
+                <w:noProof/>
+              </w:rPr>
+              <w:tab/>
+            </w:r>
+            <w:r>
+              <w:rPr>
+                <w:noProof/>
+              </w:rPr>
+              <w:fldChar w:fldCharType="begin"/>
+            </w:r>
+            <w:r>
+              <w:rPr>
+                <w:noProof/>
+              </w:rPr>
+              <w:instrText xml:space="preserve"> PAGEREF _Toc241589401 \h </w:instrText>
+            </w:r>
+            <w:r>
+              <w:rPr>
+                <w:noProof/>
+              </w:rPr>
+            </w:r>
+            <w:r>
+              <w:rPr>
+                <w:noProof/>
+              </w:rPr>
+              <w:fldChar w:fldCharType="separate"/>
+            </w:r>
+            <w:r>
+              <w:rPr>
+                <w:noProof/>
+              </w:rPr>
+              <w:t>24</w:t>
+            </w:r>
+            <w:r>
+              <w:rPr>
+                <w:noProof/>
+              </w:rPr>
+              <w:fldChar w:fldCharType="end"/>
+            </w:r>
+          </w:hyperlink>
+        </w:p>
+        <w:p>
           <w:r>
             <w:fldChar w:fldCharType="end"/>
           </w:r>
@@ -5490,7 +6273,7 @@
     <w:sdt>
       <w:sdtPr>
         <w:alias w:val="Daftar Tabel"/>
-        <w:id w:val="-281192487"/>
+        <w:id w:val="-145131118"/>
       </w:sdtPr>
       <w:sdtEndPr/>
       <w:sdtContent>
@@ -5518,7 +6301,7 @@
           <w:r>
             <w:fldChar w:fldCharType="separate"/>
           </w:r>
-          <w:hyperlink w:anchor="_Toc241588152" w:history="1">
+          <w:hyperlink w:anchor="_Toc241589402" w:history="1">
             <w:r>
               <w:rPr>
                 <w:rStyle w:val="Hyperlink"/>
@@ -5542,7 +6325,7 @@
               <w:rPr>
                 <w:noProof/>
               </w:rPr>
-              <w:instrText xml:space="preserve"> PAGEREF _Toc241588152 \h </w:instrText>
+              <w:instrText xml:space="preserve"> PAGEREF _Toc241589402 \h </w:instrText>
             </w:r>
             <w:r>
               <w:rPr>
@@ -5584,7 +6367,7 @@
               <w14:ligatures w14:val="standardContextual"/>
             </w:rPr>
           </w:pPr>
-          <w:hyperlink w:anchor="_Toc241588153" w:history="1">
+          <w:hyperlink w:anchor="_Toc241589403" w:history="1">
             <w:r>
               <w:rPr>
                 <w:rStyle w:val="Hyperlink"/>
@@ -5608,7 +6391,7 @@
               <w:rPr>
                 <w:noProof/>
               </w:rPr>
-              <w:instrText xml:space="preserve"> PAGEREF _Toc241588153 \h </w:instrText>
+              <w:instrText xml:space="preserve"> PAGEREF _Toc241589403 \h </w:instrText>
             </w:r>
             <w:r>
               <w:rPr>
@@ -5650,7 +6433,7 @@
               <w14:ligatures w14:val="standardContextual"/>
             </w:rPr>
           </w:pPr>
-          <w:hyperlink w:anchor="_Toc241588154" w:history="1">
+          <w:hyperlink w:anchor="_Toc241589404" w:history="1">
             <w:r>
               <w:rPr>
                 <w:rStyle w:val="Hyperlink"/>
@@ -5674,7 +6457,7 @@
               <w:rPr>
                 <w:noProof/>
               </w:rPr>
-              <w:instrText xml:space="preserve"> PAGEREF _Toc241588154 \h </w:instrText>
+              <w:instrText xml:space="preserve"> PAGEREF _Toc241589404 \h </w:instrText>
             </w:r>
             <w:r>
               <w:rPr>
@@ -5716,7 +6499,7 @@
               <w14:ligatures w14:val="standardContextual"/>
             </w:rPr>
           </w:pPr>
-          <w:hyperlink w:anchor="_Toc241588155" w:history="1">
+          <w:hyperlink w:anchor="_Toc241589405" w:history="1">
             <w:r>
               <w:rPr>
                 <w:rStyle w:val="Hyperlink"/>
@@ -5740,7 +6523,7 @@
               <w:rPr>
                 <w:noProof/>
               </w:rPr>
-              <w:instrText xml:space="preserve"> PAGEREF _Toc241588155 \h </w:instrText>
+              <w:instrText xml:space="preserve"> PAGEREF _Toc241589405 \h </w:instrText>
             </w:r>
             <w:r>
               <w:rPr>
@@ -5820,7 +6603,7 @@
         <w:rPr>
           <w:noProof/>
         </w:rPr>
-        <w:t>16</w:t>
+        <w:t>27</w:t>
       </w:r>
       <w:r>
         <w:fldChar w:fldCharType="end"/>
@@ -5839,7 +6622,7 @@
           <w:numId w:val="2"/>
         </w:numPr>
       </w:pPr>
-      <w:bookmarkStart w:id="0" w:name="_Toc241588096"/>
+      <w:bookmarkStart w:id="0" w:name="_Toc241589334"/>
       <w:r>
         <w:lastRenderedPageBreak/>
         <w:t>Pendahuluan</w:t>
@@ -5854,7 +6637,7 @@
           <w:numId w:val="2"/>
         </w:numPr>
       </w:pPr>
-      <w:bookmarkStart w:id="1" w:name="_Toc241588097"/>
+      <w:bookmarkStart w:id="1" w:name="_Toc241589335"/>
       <w:r>
         <w:t>Tujuan Penulisan Dokumen</w:t>
       </w:r>
@@ -5932,7 +6715,7 @@
           <w:numId w:val="2"/>
         </w:numPr>
       </w:pPr>
-      <w:bookmarkStart w:id="2" w:name="_Toc241588098"/>
+      <w:bookmarkStart w:id="2" w:name="_Toc241589336"/>
       <w:r>
         <w:t>Lingkup Masalah</w:t>
       </w:r>
@@ -6090,7 +6873,7 @@
           <w:numId w:val="2"/>
         </w:numPr>
       </w:pPr>
-      <w:bookmarkStart w:id="3" w:name="_Toc241588099"/>
+      <w:bookmarkStart w:id="3" w:name="_Toc241589337"/>
       <w:r>
         <w:lastRenderedPageBreak/>
         <w:t>Definisi, Istilah, dan Akronim</w:t>
@@ -6112,7 +6895,7 @@
         <w:keepNext/>
         <w:spacing w:before="160" w:after="80"/>
       </w:pPr>
-      <w:bookmarkStart w:id="4" w:name="_Toc241588152"/>
+      <w:bookmarkStart w:id="4" w:name="_Toc241589402"/>
       <w:r>
         <w:t xml:space="preserve">TAB- </w:t>
       </w:r>
@@ -6154,7 +6937,7 @@
           <w:left w:w="10" w:type="dxa"/>
           <w:right w:w="10" w:type="dxa"/>
         </w:tblCellMar>
-        <w:tblLook w:val="0000" w:firstRow="0" w:lastRow="0" w:firstColumn="0" w:lastColumn="0" w:noHBand="0" w:noVBand="0"/>
+        <w:tblLook w:val="04A0" w:firstRow="1" w:lastRow="0" w:firstColumn="1" w:lastColumn="0" w:noHBand="0" w:noVBand="1"/>
       </w:tblPr>
       <w:tblGrid>
         <w:gridCol w:w="2400"/>
@@ -7135,7 +7918,7 @@
           <w:numId w:val="2"/>
         </w:numPr>
       </w:pPr>
-      <w:bookmarkStart w:id="5" w:name="_Toc241588100"/>
+      <w:bookmarkStart w:id="5" w:name="_Toc241589338"/>
       <w:r>
         <w:t>Aturan Penomoran dan Penamaan</w:t>
       </w:r>
@@ -7149,7 +7932,7 @@
           <w:numId w:val="2"/>
         </w:numPr>
       </w:pPr>
-      <w:bookmarkStart w:id="6" w:name="_Toc241588101"/>
+      <w:bookmarkStart w:id="6" w:name="_Toc241589339"/>
       <w:r>
         <w:t>Aturan Penomoran dan Penamaan Spesifikasi Kebutuhan</w:t>
       </w:r>
@@ -7252,7 +8035,7 @@
           <w:numId w:val="2"/>
         </w:numPr>
       </w:pPr>
-      <w:bookmarkStart w:id="7" w:name="_Toc241588102"/>
+      <w:bookmarkStart w:id="7" w:name="_Toc241589340"/>
       <w:r>
         <w:t>Aturan Penomoran dan Penamaan Gambar</w:t>
       </w:r>
@@ -7293,7 +8076,7 @@
           <w:numId w:val="2"/>
         </w:numPr>
       </w:pPr>
-      <w:bookmarkStart w:id="8" w:name="_Toc241588103"/>
+      <w:bookmarkStart w:id="8" w:name="_Toc241589341"/>
       <w:r>
         <w:t>Aturan Penomoran dan Penamaan Tabel</w:t>
       </w:r>
@@ -7334,7 +8117,7 @@
           <w:numId w:val="2"/>
         </w:numPr>
       </w:pPr>
-      <w:bookmarkStart w:id="9" w:name="_Toc241588104"/>
+      <w:bookmarkStart w:id="9" w:name="_Toc241589342"/>
       <w:r>
         <w:t>Referensi</w:t>
       </w:r>
@@ -7399,7 +8182,7 @@
           <w:numId w:val="2"/>
         </w:numPr>
       </w:pPr>
-      <w:bookmarkStart w:id="10" w:name="_Toc241588105"/>
+      <w:bookmarkStart w:id="10" w:name="_Toc241589343"/>
       <w:r>
         <w:t>Deskripsi Umum Dokumen</w:t>
       </w:r>
@@ -7530,7 +8313,7 @@
           <w:numId w:val="2"/>
         </w:numPr>
       </w:pPr>
-      <w:bookmarkStart w:id="11" w:name="_Toc241588106"/>
+      <w:bookmarkStart w:id="11" w:name="_Toc241589344"/>
       <w:r>
         <w:t>Deskripsi Umum Perangkat Lunak</w:t>
       </w:r>
@@ -7544,7 +8327,7 @@
           <w:numId w:val="2"/>
         </w:numPr>
       </w:pPr>
-      <w:bookmarkStart w:id="12" w:name="_Toc241588107"/>
+      <w:bookmarkStart w:id="12" w:name="_Toc241589345"/>
       <w:r>
         <w:t>Deskripsi Umum Sistem</w:t>
       </w:r>
@@ -7585,7 +8368,7 @@
           <w:numId w:val="2"/>
         </w:numPr>
       </w:pPr>
-      <w:bookmarkStart w:id="13" w:name="_Toc241588108"/>
+      <w:bookmarkStart w:id="13" w:name="_Toc241589346"/>
       <w:r>
         <w:t>Karakteristik Pengguna</w:t>
       </w:r>
@@ -7597,7 +8380,7 @@
         <w:keepNext/>
         <w:spacing w:before="160" w:after="80"/>
       </w:pPr>
-      <w:bookmarkStart w:id="14" w:name="_Toc241588153"/>
+      <w:bookmarkStart w:id="14" w:name="_Toc241589403"/>
       <w:r>
         <w:t xml:space="preserve">TAB- </w:t>
       </w:r>
@@ -7639,7 +8422,7 @@
           <w:left w:w="10" w:type="dxa"/>
           <w:right w:w="10" w:type="dxa"/>
         </w:tblCellMar>
-        <w:tblLook w:val="0000" w:firstRow="0" w:lastRow="0" w:firstColumn="0" w:lastColumn="0" w:noHBand="0" w:noVBand="0"/>
+        <w:tblLook w:val="04A0" w:firstRow="1" w:lastRow="0" w:firstColumn="1" w:lastColumn="0" w:noHBand="0" w:noVBand="1"/>
       </w:tblPr>
       <w:tblGrid>
         <w:gridCol w:w="2200"/>
@@ -7884,7 +8667,7 @@
           <w:numId w:val="2"/>
         </w:numPr>
       </w:pPr>
-      <w:bookmarkStart w:id="15" w:name="_Toc241588109"/>
+      <w:bookmarkStart w:id="15" w:name="_Toc241589347"/>
       <w:r>
         <w:t>Batasan Aplikasi</w:t>
       </w:r>
@@ -7978,7 +8761,7 @@
           <w:numId w:val="2"/>
         </w:numPr>
       </w:pPr>
-      <w:bookmarkStart w:id="16" w:name="_Toc241588110"/>
+      <w:bookmarkStart w:id="16" w:name="_Toc241589348"/>
       <w:r>
         <w:t>Lingkungan Operasi</w:t>
       </w:r>
@@ -8112,7 +8895,7 @@
           <w:numId w:val="2"/>
         </w:numPr>
       </w:pPr>
-      <w:bookmarkStart w:id="17" w:name="_Toc241588111"/>
+      <w:bookmarkStart w:id="17" w:name="_Toc241589349"/>
       <w:r>
         <w:t>Deskripsi Umum Kebutuhan</w:t>
       </w:r>
@@ -8126,7 +8909,7 @@
           <w:numId w:val="2"/>
         </w:numPr>
       </w:pPr>
-      <w:bookmarkStart w:id="18" w:name="_Toc241588112"/>
+      <w:bookmarkStart w:id="18" w:name="_Toc241589350"/>
       <w:r>
         <w:t>Kebutuhan Fungsional</w:t>
       </w:r>
@@ -8138,7 +8921,7 @@
         <w:keepNext/>
         <w:spacing w:before="160" w:after="80"/>
       </w:pPr>
-      <w:bookmarkStart w:id="19" w:name="_Toc241588154"/>
+      <w:bookmarkStart w:id="19" w:name="_Toc241589404"/>
       <w:r>
         <w:t xml:space="preserve">TAB- </w:t>
       </w:r>
@@ -8180,7 +8963,7 @@
           <w:left w:w="10" w:type="dxa"/>
           <w:right w:w="10" w:type="dxa"/>
         </w:tblCellMar>
-        <w:tblLook w:val="0000" w:firstRow="0" w:lastRow="0" w:firstColumn="0" w:lastColumn="0" w:noHBand="0" w:noVBand="0"/>
+        <w:tblLook w:val="04A0" w:firstRow="1" w:lastRow="0" w:firstColumn="1" w:lastColumn="0" w:noHBand="0" w:noVBand="1"/>
       </w:tblPr>
       <w:tblGrid>
         <w:gridCol w:w="3200"/>
@@ -8921,7 +9704,7 @@
           <w:numId w:val="2"/>
         </w:numPr>
       </w:pPr>
-      <w:bookmarkStart w:id="20" w:name="_Toc241588113"/>
+      <w:bookmarkStart w:id="20" w:name="_Toc241589351"/>
       <w:r>
         <w:lastRenderedPageBreak/>
         <w:t>Kebutuhan Non Fungsional</w:t>
@@ -8934,7 +9717,7 @@
         <w:keepNext/>
         <w:spacing w:before="160" w:after="80"/>
       </w:pPr>
-      <w:bookmarkStart w:id="21" w:name="_Toc241588155"/>
+      <w:bookmarkStart w:id="21" w:name="_Toc241589405"/>
       <w:r>
         <w:t xml:space="preserve">TAB- </w:t>
       </w:r>
@@ -8976,7 +9759,7 @@
           <w:left w:w="10" w:type="dxa"/>
           <w:right w:w="10" w:type="dxa"/>
         </w:tblCellMar>
-        <w:tblLook w:val="0000" w:firstRow="0" w:lastRow="0" w:firstColumn="0" w:lastColumn="0" w:noHBand="0" w:noVBand="0"/>
+        <w:tblLook w:val="04A0" w:firstRow="1" w:lastRow="0" w:firstColumn="1" w:lastColumn="0" w:noHBand="0" w:noVBand="1"/>
       </w:tblPr>
       <w:tblGrid>
         <w:gridCol w:w="3200"/>
@@ -9556,7 +10339,7 @@
           <w:numId w:val="2"/>
         </w:numPr>
       </w:pPr>
-      <w:bookmarkStart w:id="22" w:name="_Toc241588114"/>
+      <w:bookmarkStart w:id="22" w:name="_Toc241589352"/>
       <w:r>
         <w:lastRenderedPageBreak/>
         <w:t>Perancangan Aplikasi</w:t>
@@ -9571,11 +10354,20 @@
           <w:numId w:val="2"/>
         </w:numPr>
       </w:pPr>
-      <w:bookmarkStart w:id="23" w:name="_Toc241588115"/>
+      <w:bookmarkStart w:id="23" w:name="_Toc241589353"/>
       <w:r>
         <w:t>Alur Proses Bisnis</w:t>
       </w:r>
       <w:bookmarkEnd w:id="23"/>
+    </w:p>
+    <w:p>
+      <w:pPr>
+        <w:spacing w:after="80" w:line="276" w:lineRule="auto"/>
+        <w:jc w:val="both"/>
+      </w:pPr>
+      <w:r>
+        <w:t>Alur proses bisnis digambarkan menggunakan BPMN (Business Process Model and Notation), satu diagram untuk setiap kebutuhan fungsional pada TAB-3. Setiap diagram dibagi menjadi jalur (lane) sesuai pihak yang terlibat, yaitu pengguna, sistem, dan Midtrans untuk proses pembayaran. Simbol tabung menunjukkan tabel basis data yang dibaca atau diubah pada proses tersebut.</w:t>
+      </w:r>
     </w:p>
     <w:p>
       <w:pPr>
@@ -9585,7 +10377,7 @@
           <w:numId w:val="2"/>
         </w:numPr>
       </w:pPr>
-      <w:bookmarkStart w:id="24" w:name="_Toc241588116"/>
+      <w:bookmarkStart w:id="24" w:name="_Toc241589354"/>
       <w:r>
         <w:t>BPMN Registrasi Akun Pengguna</w:t>
       </w:r>
@@ -9593,15 +10385,98 @@
     </w:p>
     <w:p>
       <w:pPr>
+        <w:keepNext/>
+        <w:spacing w:before="120"/>
+        <w:jc w:val="center"/>
+      </w:pPr>
+      <w:r>
+        <w:rPr>
+          <w:noProof/>
+        </w:rPr>
+        <w:drawing>
+          <wp:inline distT="0" distB="0" distL="0" distR="0" wp14:anchorId="5F4CE0A4" wp14:editId="2352CE9E">
+            <wp:extent cx="4295775" cy="6096000"/>
+            <wp:effectExtent l="0" t="0" r="0" b="0"/>
+            <wp:docPr id="2" name="Picture 2"/>
+            <wp:cNvGraphicFramePr>
+              <a:graphicFrameLocks xmlns:a="http://schemas.openxmlformats.org/drawingml/2006/main" noChangeAspect="1"/>
+            </wp:cNvGraphicFramePr>
+            <a:graphic xmlns:a="http://schemas.openxmlformats.org/drawingml/2006/main">
+              <a:graphicData uri="http://schemas.openxmlformats.org/drawingml/2006/picture">
+                <pic:pic xmlns:pic="http://schemas.openxmlformats.org/drawingml/2006/picture">
+                  <pic:nvPicPr>
+                    <pic:cNvPr id="0" name=""/>
+                    <pic:cNvPicPr>
+                      <a:picLocks noChangeAspect="1" noChangeArrowheads="1"/>
+                    </pic:cNvPicPr>
+                  </pic:nvPicPr>
+                  <pic:blipFill>
+                    <a:blip r:embed="rId14"/>
+                    <a:srcRect/>
+                    <a:stretch>
+                      <a:fillRect/>
+                    </a:stretch>
+                  </pic:blipFill>
+                  <pic:spPr bwMode="auto">
+                    <a:xfrm>
+                      <a:off x="0" y="0"/>
+                      <a:ext cx="4295775" cy="6096000"/>
+                    </a:xfrm>
+                    <a:prstGeom prst="rect">
+                      <a:avLst/>
+                    </a:prstGeom>
+                  </pic:spPr>
+                </pic:pic>
+              </a:graphicData>
+            </a:graphic>
+          </wp:inline>
+        </w:drawing>
+      </w:r>
+    </w:p>
+    <w:p>
+      <w:pPr>
+        <w:pStyle w:val="Caption"/>
+        <w:spacing w:before="160" w:after="80"/>
+        <w:jc w:val="center"/>
+      </w:pPr>
+      <w:bookmarkStart w:id="25" w:name="_Toc241589390"/>
+      <w:r>
+        <w:t xml:space="preserve">FIG- </w:t>
+      </w:r>
+      <w:r>
+        <w:fldChar w:fldCharType="begin"/>
+      </w:r>
+      <w:r>
+        <w:instrText>SEQ FIG</w:instrText>
+      </w:r>
+      <w:r>
+        <w:fldChar w:fldCharType="separate"/>
+      </w:r>
+      <w:r>
+        <w:rPr>
+          <w:noProof/>
+        </w:rPr>
+        <w:t>1</w:t>
+      </w:r>
+      <w:r>
+        <w:fldChar w:fldCharType="end"/>
+      </w:r>
+      <w:r>
+        <w:t xml:space="preserve"> FBPMNRegistrasi</w:t>
+      </w:r>
+      <w:bookmarkEnd w:id="25"/>
+    </w:p>
+    <w:p>
+      <w:pPr>
         <w:spacing w:after="80" w:line="276" w:lineRule="auto"/>
-      </w:pPr>
-      <w:r>
-        <w:rPr>
-          <w:i/>
-          <w:iCs/>
-          <w:color w:val="7F7F7F"/>
-        </w:rPr>
-        <w:t>[Gambar BPMN dan paragraf penjelasan, dibuat pada tahap berikutnya]</w:t>
+        <w:jc w:val="both"/>
+      </w:pPr>
+      <w:r>
+        <w:t xml:space="preserve">Proses registrasi dilakukan oleh pengunjung yang belum memiliki akun. Pengunjung membuka halaman Daftar lalu mengisi nama, nomor HP, email, password, dan kode referral jika punya. Sistem memeriksa apakah email dan nomor HP belum terdaftar serta apakah kode referral benar. </w:t>
+      </w:r>
+      <w:r>
+        <w:lastRenderedPageBreak/>
+        <w:t>Jika ada data yang salah, pengunjung diminta memperbaiki isian. Jika data valid, sistem membuat akun melalui Supabase Auth, menyimpan profil ke tabel profiles, dan langsung menyimpan sesi login sehingga pengunjung masuk sebagai Member.</w:t>
       </w:r>
     </w:p>
     <w:p>
@@ -9612,23 +10487,102 @@
           <w:numId w:val="2"/>
         </w:numPr>
       </w:pPr>
-      <w:bookmarkStart w:id="25" w:name="_Toc241588117"/>
+      <w:bookmarkStart w:id="26" w:name="_Toc241589355"/>
       <w:r>
         <w:t>BPMN Login dan Autentikasi Pengguna</w:t>
       </w:r>
-      <w:bookmarkEnd w:id="25"/>
+      <w:bookmarkEnd w:id="26"/>
+    </w:p>
+    <w:p>
+      <w:pPr>
+        <w:keepNext/>
+        <w:spacing w:before="120"/>
+        <w:jc w:val="center"/>
+      </w:pPr>
+      <w:r>
+        <w:rPr>
+          <w:noProof/>
+        </w:rPr>
+        <w:drawing>
+          <wp:inline distT="0" distB="0" distL="0" distR="0" wp14:anchorId="3ACD5179" wp14:editId="71BB7322">
+            <wp:extent cx="3905250" cy="6096000"/>
+            <wp:effectExtent l="0" t="0" r="0" b="0"/>
+            <wp:docPr id="3" name="Picture 3"/>
+            <wp:cNvGraphicFramePr>
+              <a:graphicFrameLocks xmlns:a="http://schemas.openxmlformats.org/drawingml/2006/main" noChangeAspect="1"/>
+            </wp:cNvGraphicFramePr>
+            <a:graphic xmlns:a="http://schemas.openxmlformats.org/drawingml/2006/main">
+              <a:graphicData uri="http://schemas.openxmlformats.org/drawingml/2006/picture">
+                <pic:pic xmlns:pic="http://schemas.openxmlformats.org/drawingml/2006/picture">
+                  <pic:nvPicPr>
+                    <pic:cNvPr id="0" name=""/>
+                    <pic:cNvPicPr>
+                      <a:picLocks noChangeAspect="1" noChangeArrowheads="1"/>
+                    </pic:cNvPicPr>
+                  </pic:nvPicPr>
+                  <pic:blipFill>
+                    <a:blip r:embed="rId15"/>
+                    <a:srcRect/>
+                    <a:stretch>
+                      <a:fillRect/>
+                    </a:stretch>
+                  </pic:blipFill>
+                  <pic:spPr bwMode="auto">
+                    <a:xfrm>
+                      <a:off x="0" y="0"/>
+                      <a:ext cx="3905250" cy="6096000"/>
+                    </a:xfrm>
+                    <a:prstGeom prst="rect">
+                      <a:avLst/>
+                    </a:prstGeom>
+                  </pic:spPr>
+                </pic:pic>
+              </a:graphicData>
+            </a:graphic>
+          </wp:inline>
+        </w:drawing>
+      </w:r>
+    </w:p>
+    <w:p>
+      <w:pPr>
+        <w:pStyle w:val="Caption"/>
+        <w:spacing w:before="160" w:after="80"/>
+        <w:jc w:val="center"/>
+      </w:pPr>
+      <w:bookmarkStart w:id="27" w:name="_Toc241589391"/>
+      <w:r>
+        <w:t xml:space="preserve">FIG- </w:t>
+      </w:r>
+      <w:r>
+        <w:fldChar w:fldCharType="begin"/>
+      </w:r>
+      <w:r>
+        <w:instrText>SEQ FIG</w:instrText>
+      </w:r>
+      <w:r>
+        <w:fldChar w:fldCharType="separate"/>
+      </w:r>
+      <w:r>
+        <w:rPr>
+          <w:noProof/>
+        </w:rPr>
+        <w:t>2</w:t>
+      </w:r>
+      <w:r>
+        <w:fldChar w:fldCharType="end"/>
+      </w:r>
+      <w:r>
+        <w:t xml:space="preserve"> FBPMNLogin</w:t>
+      </w:r>
+      <w:bookmarkEnd w:id="27"/>
     </w:p>
     <w:p>
       <w:pPr>
         <w:spacing w:after="80" w:line="276" w:lineRule="auto"/>
-      </w:pPr>
-      <w:r>
-        <w:rPr>
-          <w:i/>
-          <w:iCs/>
-          <w:color w:val="7F7F7F"/>
-        </w:rPr>
-        <w:t>[Gambar BPMN dan paragraf penjelasan, dibuat pada tahap berikutnya]</w:t>
+        <w:jc w:val="both"/>
+      </w:pPr>
+      <w:r>
+        <w:t>Proses login merupakan tahap awal sebelum pengguna dapat mengakses fitur Member atau panel Admin. Pengguna memasukkan email atau nomor HP beserta password pada halaman Masuk. Sistem mencari akun lalu memverifikasi password melalui Supabase Auth. Jika gagal, sistem menampilkan pesan kesalahan dan pengguna dapat mencoba lagi dengan batas jumlah percobaan. Jika berhasil dan akun tidak diblokir, sistem menyimpan sesi di cookie httpOnly dan mengarahkan pengguna ke halaman tujuan.</w:t>
       </w:r>
     </w:p>
     <w:p>
@@ -9639,23 +10593,103 @@
           <w:numId w:val="2"/>
         </w:numPr>
       </w:pPr>
-      <w:bookmarkStart w:id="26" w:name="_Toc241588118"/>
-      <w:r>
+      <w:bookmarkStart w:id="28" w:name="_Toc241589356"/>
+      <w:r>
+        <w:lastRenderedPageBreak/>
         <w:t>BPMN Pilih Game dan Produk Top-Up</w:t>
       </w:r>
-      <w:bookmarkEnd w:id="26"/>
+      <w:bookmarkEnd w:id="28"/>
+    </w:p>
+    <w:p>
+      <w:pPr>
+        <w:keepNext/>
+        <w:spacing w:before="120"/>
+        <w:jc w:val="center"/>
+      </w:pPr>
+      <w:r>
+        <w:rPr>
+          <w:noProof/>
+        </w:rPr>
+        <w:drawing>
+          <wp:inline distT="0" distB="0" distL="0" distR="0" wp14:anchorId="3F3CD9EF" wp14:editId="1C8185F6">
+            <wp:extent cx="4295775" cy="6096000"/>
+            <wp:effectExtent l="0" t="0" r="0" b="0"/>
+            <wp:docPr id="4" name="Picture 4"/>
+            <wp:cNvGraphicFramePr>
+              <a:graphicFrameLocks xmlns:a="http://schemas.openxmlformats.org/drawingml/2006/main" noChangeAspect="1"/>
+            </wp:cNvGraphicFramePr>
+            <a:graphic xmlns:a="http://schemas.openxmlformats.org/drawingml/2006/main">
+              <a:graphicData uri="http://schemas.openxmlformats.org/drawingml/2006/picture">
+                <pic:pic xmlns:pic="http://schemas.openxmlformats.org/drawingml/2006/picture">
+                  <pic:nvPicPr>
+                    <pic:cNvPr id="0" name=""/>
+                    <pic:cNvPicPr>
+                      <a:picLocks noChangeAspect="1" noChangeArrowheads="1"/>
+                    </pic:cNvPicPr>
+                  </pic:nvPicPr>
+                  <pic:blipFill>
+                    <a:blip r:embed="rId16"/>
+                    <a:srcRect/>
+                    <a:stretch>
+                      <a:fillRect/>
+                    </a:stretch>
+                  </pic:blipFill>
+                  <pic:spPr bwMode="auto">
+                    <a:xfrm>
+                      <a:off x="0" y="0"/>
+                      <a:ext cx="4295775" cy="6096000"/>
+                    </a:xfrm>
+                    <a:prstGeom prst="rect">
+                      <a:avLst/>
+                    </a:prstGeom>
+                  </pic:spPr>
+                </pic:pic>
+              </a:graphicData>
+            </a:graphic>
+          </wp:inline>
+        </w:drawing>
+      </w:r>
+    </w:p>
+    <w:p>
+      <w:pPr>
+        <w:pStyle w:val="Caption"/>
+        <w:spacing w:before="160" w:after="80"/>
+        <w:jc w:val="center"/>
+      </w:pPr>
+      <w:bookmarkStart w:id="29" w:name="_Toc241589392"/>
+      <w:r>
+        <w:t xml:space="preserve">FIG- </w:t>
+      </w:r>
+      <w:r>
+        <w:fldChar w:fldCharType="begin"/>
+      </w:r>
+      <w:r>
+        <w:instrText>SEQ FIG</w:instrText>
+      </w:r>
+      <w:r>
+        <w:fldChar w:fldCharType="separate"/>
+      </w:r>
+      <w:r>
+        <w:rPr>
+          <w:noProof/>
+        </w:rPr>
+        <w:t>3</w:t>
+      </w:r>
+      <w:r>
+        <w:fldChar w:fldCharType="end"/>
+      </w:r>
+      <w:r>
+        <w:t xml:space="preserve"> FBPMNPilihGameProduk</w:t>
+      </w:r>
+      <w:bookmarkEnd w:id="29"/>
     </w:p>
     <w:p>
       <w:pPr>
         <w:spacing w:after="80" w:line="276" w:lineRule="auto"/>
-      </w:pPr>
-      <w:r>
-        <w:rPr>
-          <w:i/>
-          <w:iCs/>
-          <w:color w:val="7F7F7F"/>
-        </w:rPr>
-        <w:t>[Gambar BPMN dan paragraf penjelasan, dibuat pada tahap berikutnya]</w:t>
+        <w:jc w:val="both"/>
+      </w:pPr>
+      <w:r>
+        <w:t>Proses ini menggambarkan cara pengguna memilih game dan produk top-up. Pengguna membuka halaman Top-Up, lalu sistem menampilkan daftar game yang aktif dari tabel games. Setelah pengguna memilih game, sistem menampilkan form top-up beserta produk dari tabel topup_products yang dikelompokkan menjadi Item Spesial dan Top Up Instan. Ketika pengguna memilih nominal, sistem langsung menampilkan harganya pada Ringkasan Pesanan.</w:t>
       </w:r>
     </w:p>
     <w:p>
@@ -9666,23 +10700,106 @@
           <w:numId w:val="2"/>
         </w:numPr>
       </w:pPr>
-      <w:bookmarkStart w:id="27" w:name="_Toc241588119"/>
-      <w:r>
+      <w:bookmarkStart w:id="30" w:name="_Toc241589357"/>
+      <w:r>
+        <w:lastRenderedPageBreak/>
         <w:t>BPMN Transaksi Top-Up Game</w:t>
       </w:r>
-      <w:bookmarkEnd w:id="27"/>
+      <w:bookmarkEnd w:id="30"/>
+    </w:p>
+    <w:p>
+      <w:pPr>
+        <w:keepNext/>
+        <w:spacing w:before="120"/>
+        <w:jc w:val="center"/>
+      </w:pPr>
+      <w:r>
+        <w:rPr>
+          <w:noProof/>
+        </w:rPr>
+        <w:drawing>
+          <wp:inline distT="0" distB="0" distL="0" distR="0" wp14:anchorId="2FFCE391" wp14:editId="13B30A2B">
+            <wp:extent cx="3581400" cy="6096000"/>
+            <wp:effectExtent l="0" t="0" r="0" b="0"/>
+            <wp:docPr id="5" name="Picture 5"/>
+            <wp:cNvGraphicFramePr>
+              <a:graphicFrameLocks xmlns:a="http://schemas.openxmlformats.org/drawingml/2006/main" noChangeAspect="1"/>
+            </wp:cNvGraphicFramePr>
+            <a:graphic xmlns:a="http://schemas.openxmlformats.org/drawingml/2006/main">
+              <a:graphicData uri="http://schemas.openxmlformats.org/drawingml/2006/picture">
+                <pic:pic xmlns:pic="http://schemas.openxmlformats.org/drawingml/2006/picture">
+                  <pic:nvPicPr>
+                    <pic:cNvPr id="0" name=""/>
+                    <pic:cNvPicPr>
+                      <a:picLocks noChangeAspect="1" noChangeArrowheads="1"/>
+                    </pic:cNvPicPr>
+                  </pic:nvPicPr>
+                  <pic:blipFill>
+                    <a:blip r:embed="rId17"/>
+                    <a:srcRect/>
+                    <a:stretch>
+                      <a:fillRect/>
+                    </a:stretch>
+                  </pic:blipFill>
+                  <pic:spPr bwMode="auto">
+                    <a:xfrm>
+                      <a:off x="0" y="0"/>
+                      <a:ext cx="3581400" cy="6096000"/>
+                    </a:xfrm>
+                    <a:prstGeom prst="rect">
+                      <a:avLst/>
+                    </a:prstGeom>
+                  </pic:spPr>
+                </pic:pic>
+              </a:graphicData>
+            </a:graphic>
+          </wp:inline>
+        </w:drawing>
+      </w:r>
+    </w:p>
+    <w:p>
+      <w:pPr>
+        <w:pStyle w:val="Caption"/>
+        <w:spacing w:before="160" w:after="80"/>
+        <w:jc w:val="center"/>
+      </w:pPr>
+      <w:bookmarkStart w:id="31" w:name="_Toc241589393"/>
+      <w:r>
+        <w:t xml:space="preserve">FIG- </w:t>
+      </w:r>
+      <w:r>
+        <w:fldChar w:fldCharType="begin"/>
+      </w:r>
+      <w:r>
+        <w:instrText>SEQ FIG</w:instrText>
+      </w:r>
+      <w:r>
+        <w:fldChar w:fldCharType="separate"/>
+      </w:r>
+      <w:r>
+        <w:rPr>
+          <w:noProof/>
+        </w:rPr>
+        <w:t>4</w:t>
+      </w:r>
+      <w:r>
+        <w:fldChar w:fldCharType="end"/>
+      </w:r>
+      <w:r>
+        <w:t xml:space="preserve"> FBPMNTransaksiTopUp</w:t>
+      </w:r>
+      <w:bookmarkEnd w:id="31"/>
     </w:p>
     <w:p>
       <w:pPr>
         <w:spacing w:after="80" w:line="276" w:lineRule="auto"/>
-      </w:pPr>
-      <w:r>
-        <w:rPr>
-          <w:i/>
-          <w:iCs/>
-          <w:color w:val="7F7F7F"/>
-        </w:rPr>
-        <w:t>[Gambar BPMN dan paragraf penjelasan, dibuat pada tahap berikutnya]</w:t>
+        <w:jc w:val="both"/>
+      </w:pPr>
+      <w:r>
+        <w:t xml:space="preserve">Proses transaksi top-up dimulai ketika pengguna mengisi ID akun game (serta server atau zona untuk game tertentu), memilih nominal, mengisi kontak, dan memilih metode pembayaran, lalu menekan Pesan Sekarang. Sistem memvalidasi produk, ID akun, dan server. Jika valid, sistem menghitung harga, potongan promo, dan biaya metode pembayaran di server. Untuk metode Balance proses dilanjutkan ke F-08, sedangkan untuk metode Midtrans sistem membuat invoice dengan status PENDING di tabel topup_orders dan menampilkan </w:t>
+      </w:r>
+      <w:r>
+        <w:t>modal Invoice Dibuat.</w:t>
       </w:r>
     </w:p>
     <w:p>
@@ -9693,23 +10810,103 @@
           <w:numId w:val="2"/>
         </w:numPr>
       </w:pPr>
-      <w:bookmarkStart w:id="28" w:name="_Toc241588120"/>
-      <w:r>
+      <w:bookmarkStart w:id="32" w:name="_Toc241589358"/>
+      <w:r>
+        <w:lastRenderedPageBreak/>
         <w:t>BPMN Penggunaan Kode Promo</w:t>
       </w:r>
-      <w:bookmarkEnd w:id="28"/>
+      <w:bookmarkEnd w:id="32"/>
+    </w:p>
+    <w:p>
+      <w:pPr>
+        <w:keepNext/>
+        <w:spacing w:before="120"/>
+        <w:jc w:val="center"/>
+      </w:pPr>
+      <w:r>
+        <w:rPr>
+          <w:noProof/>
+        </w:rPr>
+        <w:drawing>
+          <wp:inline distT="0" distB="0" distL="0" distR="0" wp14:anchorId="5699DAF4" wp14:editId="6771997B">
+            <wp:extent cx="4772025" cy="6096000"/>
+            <wp:effectExtent l="0" t="0" r="0" b="0"/>
+            <wp:docPr id="6" name="Picture 6"/>
+            <wp:cNvGraphicFramePr>
+              <a:graphicFrameLocks xmlns:a="http://schemas.openxmlformats.org/drawingml/2006/main" noChangeAspect="1"/>
+            </wp:cNvGraphicFramePr>
+            <a:graphic xmlns:a="http://schemas.openxmlformats.org/drawingml/2006/main">
+              <a:graphicData uri="http://schemas.openxmlformats.org/drawingml/2006/picture">
+                <pic:pic xmlns:pic="http://schemas.openxmlformats.org/drawingml/2006/picture">
+                  <pic:nvPicPr>
+                    <pic:cNvPr id="0" name=""/>
+                    <pic:cNvPicPr>
+                      <a:picLocks noChangeAspect="1" noChangeArrowheads="1"/>
+                    </pic:cNvPicPr>
+                  </pic:nvPicPr>
+                  <pic:blipFill>
+                    <a:blip r:embed="rId18"/>
+                    <a:srcRect/>
+                    <a:stretch>
+                      <a:fillRect/>
+                    </a:stretch>
+                  </pic:blipFill>
+                  <pic:spPr bwMode="auto">
+                    <a:xfrm>
+                      <a:off x="0" y="0"/>
+                      <a:ext cx="4772025" cy="6096000"/>
+                    </a:xfrm>
+                    <a:prstGeom prst="rect">
+                      <a:avLst/>
+                    </a:prstGeom>
+                  </pic:spPr>
+                </pic:pic>
+              </a:graphicData>
+            </a:graphic>
+          </wp:inline>
+        </w:drawing>
+      </w:r>
+    </w:p>
+    <w:p>
+      <w:pPr>
+        <w:pStyle w:val="Caption"/>
+        <w:spacing w:before="160" w:after="80"/>
+        <w:jc w:val="center"/>
+      </w:pPr>
+      <w:bookmarkStart w:id="33" w:name="_Toc241589394"/>
+      <w:r>
+        <w:t xml:space="preserve">FIG- </w:t>
+      </w:r>
+      <w:r>
+        <w:fldChar w:fldCharType="begin"/>
+      </w:r>
+      <w:r>
+        <w:instrText>SEQ FIG</w:instrText>
+      </w:r>
+      <w:r>
+        <w:fldChar w:fldCharType="separate"/>
+      </w:r>
+      <w:r>
+        <w:rPr>
+          <w:noProof/>
+        </w:rPr>
+        <w:t>5</w:t>
+      </w:r>
+      <w:r>
+        <w:fldChar w:fldCharType="end"/>
+      </w:r>
+      <w:r>
+        <w:t xml:space="preserve"> FBPMNKodePromo</w:t>
+      </w:r>
+      <w:bookmarkEnd w:id="33"/>
     </w:p>
     <w:p>
       <w:pPr>
         <w:spacing w:after="80" w:line="276" w:lineRule="auto"/>
-      </w:pPr>
-      <w:r>
-        <w:rPr>
-          <w:i/>
-          <w:iCs/>
-          <w:color w:val="7F7F7F"/>
-        </w:rPr>
-        <w:t>[Gambar BPMN dan paragraf penjelasan, dibuat pada tahap berikutnya]</w:t>
+        <w:jc w:val="both"/>
+      </w:pPr>
+      <w:r>
+        <w:t>Kode promo bersifat opsional pada form top-up. Pengguna mengisi kode promo lalu menekan Pakai, kemudian sistem mencari kode tersebut di tabel promo_codes dan memeriksa masa berlaku serta sisa kuotanya. Jika kode tidak berlaku, sistem menampilkan pesan dan pengguna dapat mengganti kode. Jika berlaku, sistem menghitung potongan harga dan memperbarui Ringkasan Pesanan. Kode promo diperiksa sekali lagi oleh server saat invoice dibuat, dan kuotanya baru berkurang setelah pembayaran berhasil.</w:t>
       </w:r>
     </w:p>
     <w:p>
@@ -9720,23 +10917,106 @@
           <w:numId w:val="2"/>
         </w:numPr>
       </w:pPr>
-      <w:bookmarkStart w:id="29" w:name="_Toc241588121"/>
-      <w:r>
+      <w:bookmarkStart w:id="34" w:name="_Toc241589359"/>
+      <w:r>
+        <w:lastRenderedPageBreak/>
         <w:t>BPMN Pembayaran melalui Payment Gateway (Midtrans)</w:t>
       </w:r>
-      <w:bookmarkEnd w:id="29"/>
+      <w:bookmarkEnd w:id="34"/>
+    </w:p>
+    <w:p>
+      <w:pPr>
+        <w:keepNext/>
+        <w:spacing w:before="120"/>
+        <w:jc w:val="center"/>
+      </w:pPr>
+      <w:r>
+        <w:rPr>
+          <w:noProof/>
+        </w:rPr>
+        <w:drawing>
+          <wp:inline distT="0" distB="0" distL="0" distR="0" wp14:anchorId="0C19F188" wp14:editId="5A53ACD2">
+            <wp:extent cx="4848225" cy="6096000"/>
+            <wp:effectExtent l="0" t="0" r="0" b="0"/>
+            <wp:docPr id="7" name="Picture 7"/>
+            <wp:cNvGraphicFramePr>
+              <a:graphicFrameLocks xmlns:a="http://schemas.openxmlformats.org/drawingml/2006/main" noChangeAspect="1"/>
+            </wp:cNvGraphicFramePr>
+            <a:graphic xmlns:a="http://schemas.openxmlformats.org/drawingml/2006/main">
+              <a:graphicData uri="http://schemas.openxmlformats.org/drawingml/2006/picture">
+                <pic:pic xmlns:pic="http://schemas.openxmlformats.org/drawingml/2006/picture">
+                  <pic:nvPicPr>
+                    <pic:cNvPr id="0" name=""/>
+                    <pic:cNvPicPr>
+                      <a:picLocks noChangeAspect="1" noChangeArrowheads="1"/>
+                    </pic:cNvPicPr>
+                  </pic:nvPicPr>
+                  <pic:blipFill>
+                    <a:blip r:embed="rId19"/>
+                    <a:srcRect/>
+                    <a:stretch>
+                      <a:fillRect/>
+                    </a:stretch>
+                  </pic:blipFill>
+                  <pic:spPr bwMode="auto">
+                    <a:xfrm>
+                      <a:off x="0" y="0"/>
+                      <a:ext cx="4848225" cy="6096000"/>
+                    </a:xfrm>
+                    <a:prstGeom prst="rect">
+                      <a:avLst/>
+                    </a:prstGeom>
+                  </pic:spPr>
+                </pic:pic>
+              </a:graphicData>
+            </a:graphic>
+          </wp:inline>
+        </w:drawing>
+      </w:r>
+    </w:p>
+    <w:p>
+      <w:pPr>
+        <w:pStyle w:val="Caption"/>
+        <w:spacing w:before="160" w:after="80"/>
+        <w:jc w:val="center"/>
+      </w:pPr>
+      <w:bookmarkStart w:id="35" w:name="_Toc241589395"/>
+      <w:r>
+        <w:t xml:space="preserve">FIG- </w:t>
+      </w:r>
+      <w:r>
+        <w:fldChar w:fldCharType="begin"/>
+      </w:r>
+      <w:r>
+        <w:instrText>SEQ FIG</w:instrText>
+      </w:r>
+      <w:r>
+        <w:fldChar w:fldCharType="separate"/>
+      </w:r>
+      <w:r>
+        <w:rPr>
+          <w:noProof/>
+        </w:rPr>
+        <w:t>6</w:t>
+      </w:r>
+      <w:r>
+        <w:fldChar w:fldCharType="end"/>
+      </w:r>
+      <w:r>
+        <w:t xml:space="preserve"> FBPMNPembayaranMidtrans</w:t>
+      </w:r>
+      <w:bookmarkEnd w:id="35"/>
     </w:p>
     <w:p>
       <w:pPr>
         <w:spacing w:after="80" w:line="276" w:lineRule="auto"/>
-      </w:pPr>
-      <w:r>
-        <w:rPr>
-          <w:i/>
-          <w:iCs/>
-          <w:color w:val="7F7F7F"/>
-        </w:rPr>
-        <w:t>[Gambar BPMN dan paragraf penjelasan, dibuat pada tahap berikutnya]</w:t>
+        <w:jc w:val="both"/>
+      </w:pPr>
+      <w:r>
+        <w:t xml:space="preserve">Proses pembayaran melalui Midtrans melibatkan pengguna, sistem, dan Midtrans. Setelah pengguna menekan Lanjutkan ke Pembayaran, sistem membuka sesi Midtrans Snap dan pengguna membayar sesuai metode yang dipilih. Midtrans mengirim notifikasi ke sistem, lalu sistem memverifikasi tanda tangan notifikasi dan menanyakan status sebenarnya ke Status API. Jika status PAID dan nominal sesuai, invoice ditandai berhasil, item dikirim (disimulasikan), dan poin loyalti ditambahkan. Jika gagal atau melewati batas waktu, </w:t>
+      </w:r>
+      <w:r>
+        <w:t>invoice ditandai gagal atau kedaluwarsa.</w:t>
       </w:r>
     </w:p>
     <w:p>
@@ -9747,23 +11027,103 @@
           <w:numId w:val="2"/>
         </w:numPr>
       </w:pPr>
-      <w:bookmarkStart w:id="30" w:name="_Toc241588122"/>
-      <w:r>
+      <w:bookmarkStart w:id="36" w:name="_Toc241589360"/>
+      <w:r>
+        <w:lastRenderedPageBreak/>
         <w:t>BPMN Pengisian Balance (BLC)</w:t>
       </w:r>
-      <w:bookmarkEnd w:id="30"/>
+      <w:bookmarkEnd w:id="36"/>
+    </w:p>
+    <w:p>
+      <w:pPr>
+        <w:keepNext/>
+        <w:spacing w:before="120"/>
+        <w:jc w:val="center"/>
+      </w:pPr>
+      <w:r>
+        <w:rPr>
+          <w:noProof/>
+        </w:rPr>
+        <w:drawing>
+          <wp:inline distT="0" distB="0" distL="0" distR="0" wp14:anchorId="5719D9E4" wp14:editId="15C8E55C">
+            <wp:extent cx="4152900" cy="6096000"/>
+            <wp:effectExtent l="0" t="0" r="0" b="0"/>
+            <wp:docPr id="8" name="Picture 8"/>
+            <wp:cNvGraphicFramePr>
+              <a:graphicFrameLocks xmlns:a="http://schemas.openxmlformats.org/drawingml/2006/main" noChangeAspect="1"/>
+            </wp:cNvGraphicFramePr>
+            <a:graphic xmlns:a="http://schemas.openxmlformats.org/drawingml/2006/main">
+              <a:graphicData uri="http://schemas.openxmlformats.org/drawingml/2006/picture">
+                <pic:pic xmlns:pic="http://schemas.openxmlformats.org/drawingml/2006/picture">
+                  <pic:nvPicPr>
+                    <pic:cNvPr id="0" name=""/>
+                    <pic:cNvPicPr>
+                      <a:picLocks noChangeAspect="1" noChangeArrowheads="1"/>
+                    </pic:cNvPicPr>
+                  </pic:nvPicPr>
+                  <pic:blipFill>
+                    <a:blip r:embed="rId20"/>
+                    <a:srcRect/>
+                    <a:stretch>
+                      <a:fillRect/>
+                    </a:stretch>
+                  </pic:blipFill>
+                  <pic:spPr bwMode="auto">
+                    <a:xfrm>
+                      <a:off x="0" y="0"/>
+                      <a:ext cx="4152900" cy="6096000"/>
+                    </a:xfrm>
+                    <a:prstGeom prst="rect">
+                      <a:avLst/>
+                    </a:prstGeom>
+                  </pic:spPr>
+                </pic:pic>
+              </a:graphicData>
+            </a:graphic>
+          </wp:inline>
+        </w:drawing>
+      </w:r>
+    </w:p>
+    <w:p>
+      <w:pPr>
+        <w:pStyle w:val="Caption"/>
+        <w:spacing w:before="160" w:after="80"/>
+        <w:jc w:val="center"/>
+      </w:pPr>
+      <w:bookmarkStart w:id="37" w:name="_Toc241589396"/>
+      <w:r>
+        <w:t xml:space="preserve">FIG- </w:t>
+      </w:r>
+      <w:r>
+        <w:fldChar w:fldCharType="begin"/>
+      </w:r>
+      <w:r>
+        <w:instrText>SEQ FIG</w:instrText>
+      </w:r>
+      <w:r>
+        <w:fldChar w:fldCharType="separate"/>
+      </w:r>
+      <w:r>
+        <w:rPr>
+          <w:noProof/>
+        </w:rPr>
+        <w:t>7</w:t>
+      </w:r>
+      <w:r>
+        <w:fldChar w:fldCharType="end"/>
+      </w:r>
+      <w:r>
+        <w:t xml:space="preserve"> FBPMNPengisianBalance</w:t>
+      </w:r>
+      <w:bookmarkEnd w:id="37"/>
     </w:p>
     <w:p>
       <w:pPr>
         <w:spacing w:after="80" w:line="276" w:lineRule="auto"/>
-      </w:pPr>
-      <w:r>
-        <w:rPr>
-          <w:i/>
-          <w:iCs/>
-          <w:color w:val="7F7F7F"/>
-        </w:rPr>
-        <w:t>[Gambar BPMN dan paragraf penjelasan, dibuat pada tahap berikutnya]</w:t>
+        <w:jc w:val="both"/>
+      </w:pPr>
+      <w:r>
+        <w:t>Pengisian Balance hanya dapat dilakukan oleh Member. Member memilih nominal voucher, jumlah, dan metode pembayaran pada halaman Balance. Sistem memvalidasi nominal dan jumlah, lalu membuat invoice BL dengan status PENDING di tabel balance_topups. Setelah Member membayar di halaman Midtrans, Midtrans mengirim notifikasi ke sistem. Jika pembayaran berhasil, sistem menambah saldo Balance dan mencatat mutasinya di tabel balance_ledger dalam satu transaksi. Jika gagal atau kedaluwarsa, saldo tidak berubah.</w:t>
       </w:r>
     </w:p>
     <w:p>
@@ -9774,23 +11134,103 @@
           <w:numId w:val="2"/>
         </w:numPr>
       </w:pPr>
-      <w:bookmarkStart w:id="31" w:name="_Toc241588123"/>
-      <w:r>
+      <w:bookmarkStart w:id="38" w:name="_Toc241589361"/>
+      <w:r>
+        <w:lastRenderedPageBreak/>
         <w:t>BPMN Pembayaran Top-Up dengan Balance</w:t>
       </w:r>
-      <w:bookmarkEnd w:id="31"/>
+      <w:bookmarkEnd w:id="38"/>
+    </w:p>
+    <w:p>
+      <w:pPr>
+        <w:keepNext/>
+        <w:spacing w:before="120"/>
+        <w:jc w:val="center"/>
+      </w:pPr>
+      <w:r>
+        <w:rPr>
+          <w:noProof/>
+        </w:rPr>
+        <w:drawing>
+          <wp:inline distT="0" distB="0" distL="0" distR="0" wp14:anchorId="5713B29E" wp14:editId="29B83A15">
+            <wp:extent cx="3905250" cy="6096000"/>
+            <wp:effectExtent l="0" t="0" r="0" b="0"/>
+            <wp:docPr id="9" name="Picture 9"/>
+            <wp:cNvGraphicFramePr>
+              <a:graphicFrameLocks xmlns:a="http://schemas.openxmlformats.org/drawingml/2006/main" noChangeAspect="1"/>
+            </wp:cNvGraphicFramePr>
+            <a:graphic xmlns:a="http://schemas.openxmlformats.org/drawingml/2006/main">
+              <a:graphicData uri="http://schemas.openxmlformats.org/drawingml/2006/picture">
+                <pic:pic xmlns:pic="http://schemas.openxmlformats.org/drawingml/2006/picture">
+                  <pic:nvPicPr>
+                    <pic:cNvPr id="0" name=""/>
+                    <pic:cNvPicPr>
+                      <a:picLocks noChangeAspect="1" noChangeArrowheads="1"/>
+                    </pic:cNvPicPr>
+                  </pic:nvPicPr>
+                  <pic:blipFill>
+                    <a:blip r:embed="rId21"/>
+                    <a:srcRect/>
+                    <a:stretch>
+                      <a:fillRect/>
+                    </a:stretch>
+                  </pic:blipFill>
+                  <pic:spPr bwMode="auto">
+                    <a:xfrm>
+                      <a:off x="0" y="0"/>
+                      <a:ext cx="3905250" cy="6096000"/>
+                    </a:xfrm>
+                    <a:prstGeom prst="rect">
+                      <a:avLst/>
+                    </a:prstGeom>
+                  </pic:spPr>
+                </pic:pic>
+              </a:graphicData>
+            </a:graphic>
+          </wp:inline>
+        </w:drawing>
+      </w:r>
+    </w:p>
+    <w:p>
+      <w:pPr>
+        <w:pStyle w:val="Caption"/>
+        <w:spacing w:before="160" w:after="80"/>
+        <w:jc w:val="center"/>
+      </w:pPr>
+      <w:bookmarkStart w:id="39" w:name="_Toc241589397"/>
+      <w:r>
+        <w:t xml:space="preserve">FIG- </w:t>
+      </w:r>
+      <w:r>
+        <w:fldChar w:fldCharType="begin"/>
+      </w:r>
+      <w:r>
+        <w:instrText>SEQ FIG</w:instrText>
+      </w:r>
+      <w:r>
+        <w:fldChar w:fldCharType="separate"/>
+      </w:r>
+      <w:r>
+        <w:rPr>
+          <w:noProof/>
+        </w:rPr>
+        <w:t>8</w:t>
+      </w:r>
+      <w:r>
+        <w:fldChar w:fldCharType="end"/>
+      </w:r>
+      <w:r>
+        <w:t xml:space="preserve"> FBPMNBayarBalance</w:t>
+      </w:r>
+      <w:bookmarkEnd w:id="39"/>
     </w:p>
     <w:p>
       <w:pPr>
         <w:spacing w:after="80" w:line="276" w:lineRule="auto"/>
-      </w:pPr>
-      <w:r>
-        <w:rPr>
-          <w:i/>
-          <w:iCs/>
-          <w:color w:val="7F7F7F"/>
-        </w:rPr>
-        <w:t>[Gambar BPMN dan paragraf penjelasan, dibuat pada tahap berikutnya]</w:t>
+        <w:jc w:val="both"/>
+      </w:pPr>
+      <w:r>
+        <w:t>Pembayaran dengan Balance hanya dapat dipakai oleh Member yang sudah login. Setelah Member memilih metode Balance dan menekan Pesan Sekarang, sistem memeriksa sesi login lalu menghitung total bayar tanpa biaya metode. Sistem kemudian memeriksa apakah saldo mencukupi. Jika cukup, saldo dipotong, mutasi dicatat di balance_ledger, dan invoice langsung berstatus berhasil dalam satu transaksi database, lalu poin loyalti ditambahkan. Jika saldo kurang, sistem menampilkan pesan Balance tidak mencukupi.</w:t>
       </w:r>
     </w:p>
     <w:p>
@@ -9801,23 +11241,103 @@
           <w:numId w:val="2"/>
         </w:numPr>
       </w:pPr>
-      <w:bookmarkStart w:id="32" w:name="_Toc241588124"/>
-      <w:r>
+      <w:bookmarkStart w:id="40" w:name="_Toc241589362"/>
+      <w:r>
+        <w:lastRenderedPageBreak/>
         <w:t>BPMN Cek Status Transaksi (Nomor Invoice)</w:t>
       </w:r>
-      <w:bookmarkEnd w:id="32"/>
+      <w:bookmarkEnd w:id="40"/>
+    </w:p>
+    <w:p>
+      <w:pPr>
+        <w:keepNext/>
+        <w:spacing w:before="120"/>
+        <w:jc w:val="center"/>
+      </w:pPr>
+      <w:r>
+        <w:rPr>
+          <w:noProof/>
+        </w:rPr>
+        <w:drawing>
+          <wp:inline distT="0" distB="0" distL="0" distR="0" wp14:anchorId="1B98F393" wp14:editId="55C50DDE">
+            <wp:extent cx="3905250" cy="6096000"/>
+            <wp:effectExtent l="0" t="0" r="0" b="0"/>
+            <wp:docPr id="10" name="Picture 10"/>
+            <wp:cNvGraphicFramePr>
+              <a:graphicFrameLocks xmlns:a="http://schemas.openxmlformats.org/drawingml/2006/main" noChangeAspect="1"/>
+            </wp:cNvGraphicFramePr>
+            <a:graphic xmlns:a="http://schemas.openxmlformats.org/drawingml/2006/main">
+              <a:graphicData uri="http://schemas.openxmlformats.org/drawingml/2006/picture">
+                <pic:pic xmlns:pic="http://schemas.openxmlformats.org/drawingml/2006/picture">
+                  <pic:nvPicPr>
+                    <pic:cNvPr id="0" name=""/>
+                    <pic:cNvPicPr>
+                      <a:picLocks noChangeAspect="1" noChangeArrowheads="1"/>
+                    </pic:cNvPicPr>
+                  </pic:nvPicPr>
+                  <pic:blipFill>
+                    <a:blip r:embed="rId22"/>
+                    <a:srcRect/>
+                    <a:stretch>
+                      <a:fillRect/>
+                    </a:stretch>
+                  </pic:blipFill>
+                  <pic:spPr bwMode="auto">
+                    <a:xfrm>
+                      <a:off x="0" y="0"/>
+                      <a:ext cx="3905250" cy="6096000"/>
+                    </a:xfrm>
+                    <a:prstGeom prst="rect">
+                      <a:avLst/>
+                    </a:prstGeom>
+                  </pic:spPr>
+                </pic:pic>
+              </a:graphicData>
+            </a:graphic>
+          </wp:inline>
+        </w:drawing>
+      </w:r>
+    </w:p>
+    <w:p>
+      <w:pPr>
+        <w:pStyle w:val="Caption"/>
+        <w:spacing w:before="160" w:after="80"/>
+        <w:jc w:val="center"/>
+      </w:pPr>
+      <w:bookmarkStart w:id="41" w:name="_Toc241589398"/>
+      <w:r>
+        <w:t xml:space="preserve">FIG- </w:t>
+      </w:r>
+      <w:r>
+        <w:fldChar w:fldCharType="begin"/>
+      </w:r>
+      <w:r>
+        <w:instrText>SEQ FIG</w:instrText>
+      </w:r>
+      <w:r>
+        <w:fldChar w:fldCharType="separate"/>
+      </w:r>
+      <w:r>
+        <w:rPr>
+          <w:noProof/>
+        </w:rPr>
+        <w:t>9</w:t>
+      </w:r>
+      <w:r>
+        <w:fldChar w:fldCharType="end"/>
+      </w:r>
+      <w:r>
+        <w:t xml:space="preserve"> FBPMNCekInvoice</w:t>
+      </w:r>
+      <w:bookmarkEnd w:id="41"/>
     </w:p>
     <w:p>
       <w:pPr>
         <w:spacing w:after="80" w:line="276" w:lineRule="auto"/>
-      </w:pPr>
-      <w:r>
-        <w:rPr>
-          <w:i/>
-          <w:iCs/>
-          <w:color w:val="7F7F7F"/>
-        </w:rPr>
-        <w:t>[Gambar BPMN dan paragraf penjelasan, dibuat pada tahap berikutnya]</w:t>
+        <w:jc w:val="both"/>
+      </w:pPr>
+      <w:r>
+        <w:t>Cek status transaksi dapat dilakukan oleh siapa pun tanpa login. Pengguna memasukkan nomor invoice lengkap pada halaman Cek Invoice. Sistem mencari invoice di tabel topup_orders. Jika tidak ditemukan, sistem menampilkan pesan Invoice Tidak Ditemukan. Jika invoice masih menunggu pembayaran, sistem terlebih dahulu menanyakan status terbaru ke Midtrans. Sistem kemudian menampilkan detail transaksi dengan ID akun game yang disamarkan untuk melindungi data pembeli.</w:t>
       </w:r>
     </w:p>
     <w:p>
@@ -9828,23 +11348,103 @@
           <w:numId w:val="2"/>
         </w:numPr>
       </w:pPr>
-      <w:bookmarkStart w:id="33" w:name="_Toc241588125"/>
-      <w:r>
+      <w:bookmarkStart w:id="42" w:name="_Toc241589363"/>
+      <w:r>
+        <w:lastRenderedPageBreak/>
         <w:t>BPMN Profil dan Riwayat Transaksi Pengguna</w:t>
       </w:r>
-      <w:bookmarkEnd w:id="33"/>
+      <w:bookmarkEnd w:id="42"/>
+    </w:p>
+    <w:p>
+      <w:pPr>
+        <w:keepNext/>
+        <w:spacing w:before="120"/>
+        <w:jc w:val="center"/>
+      </w:pPr>
+      <w:r>
+        <w:rPr>
+          <w:noProof/>
+        </w:rPr>
+        <w:drawing>
+          <wp:inline distT="0" distB="0" distL="0" distR="0" wp14:anchorId="03B1D1B9" wp14:editId="57C7520A">
+            <wp:extent cx="4772025" cy="6096000"/>
+            <wp:effectExtent l="0" t="0" r="0" b="0"/>
+            <wp:docPr id="11" name="Picture 11"/>
+            <wp:cNvGraphicFramePr>
+              <a:graphicFrameLocks xmlns:a="http://schemas.openxmlformats.org/drawingml/2006/main" noChangeAspect="1"/>
+            </wp:cNvGraphicFramePr>
+            <a:graphic xmlns:a="http://schemas.openxmlformats.org/drawingml/2006/main">
+              <a:graphicData uri="http://schemas.openxmlformats.org/drawingml/2006/picture">
+                <pic:pic xmlns:pic="http://schemas.openxmlformats.org/drawingml/2006/picture">
+                  <pic:nvPicPr>
+                    <pic:cNvPr id="0" name=""/>
+                    <pic:cNvPicPr>
+                      <a:picLocks noChangeAspect="1" noChangeArrowheads="1"/>
+                    </pic:cNvPicPr>
+                  </pic:nvPicPr>
+                  <pic:blipFill>
+                    <a:blip r:embed="rId23"/>
+                    <a:srcRect/>
+                    <a:stretch>
+                      <a:fillRect/>
+                    </a:stretch>
+                  </pic:blipFill>
+                  <pic:spPr bwMode="auto">
+                    <a:xfrm>
+                      <a:off x="0" y="0"/>
+                      <a:ext cx="4772025" cy="6096000"/>
+                    </a:xfrm>
+                    <a:prstGeom prst="rect">
+                      <a:avLst/>
+                    </a:prstGeom>
+                  </pic:spPr>
+                </pic:pic>
+              </a:graphicData>
+            </a:graphic>
+          </wp:inline>
+        </w:drawing>
+      </w:r>
+    </w:p>
+    <w:p>
+      <w:pPr>
+        <w:pStyle w:val="Caption"/>
+        <w:spacing w:before="160" w:after="80"/>
+        <w:jc w:val="center"/>
+      </w:pPr>
+      <w:bookmarkStart w:id="43" w:name="_Toc241589399"/>
+      <w:r>
+        <w:t xml:space="preserve">FIG- </w:t>
+      </w:r>
+      <w:r>
+        <w:fldChar w:fldCharType="begin"/>
+      </w:r>
+      <w:r>
+        <w:instrText>SEQ FIG</w:instrText>
+      </w:r>
+      <w:r>
+        <w:fldChar w:fldCharType="separate"/>
+      </w:r>
+      <w:r>
+        <w:rPr>
+          <w:noProof/>
+        </w:rPr>
+        <w:t>10</w:t>
+      </w:r>
+      <w:r>
+        <w:fldChar w:fldCharType="end"/>
+      </w:r>
+      <w:r>
+        <w:t xml:space="preserve"> FBPMNProfilRiwayat</w:t>
+      </w:r>
+      <w:bookmarkEnd w:id="43"/>
     </w:p>
     <w:p>
       <w:pPr>
         <w:spacing w:after="80" w:line="276" w:lineRule="auto"/>
-      </w:pPr>
-      <w:r>
-        <w:rPr>
-          <w:i/>
-          <w:iCs/>
-          <w:color w:val="7F7F7F"/>
-        </w:rPr>
-        <w:t>[Gambar BPMN dan paragraf penjelasan, dibuat pada tahap berikutnya]</w:t>
+        <w:jc w:val="both"/>
+      </w:pPr>
+      <w:r>
+        <w:t>Member dapat mengelola profil dan melihat riwayat transaksi melalui menu Akun Saya. Sistem terlebih dahulu memeriksa sesi login. Pada menu Profil Saya, sistem menampilkan data profil dan Member dapat mengubah nama, nomor HP, atau password. Perubahan divalidasi sebelum disimpan, misalnya nomor HP tidak boleh dipakai akun lain dan password lama harus benar. Pada menu Transaksi, sistem hanya menampilkan riwayat top-up dan pengisian Balance milik Member tersebut.</w:t>
       </w:r>
     </w:p>
     <w:p>
@@ -9855,23 +11455,103 @@
           <w:numId w:val="2"/>
         </w:numPr>
       </w:pPr>
-      <w:bookmarkStart w:id="34" w:name="_Toc241588126"/>
-      <w:r>
+      <w:bookmarkStart w:id="44" w:name="_Toc241589364"/>
+      <w:r>
+        <w:lastRenderedPageBreak/>
         <w:t>BPMN Riwayat Mutasi Balance</w:t>
       </w:r>
-      <w:bookmarkEnd w:id="34"/>
+      <w:bookmarkEnd w:id="44"/>
+    </w:p>
+    <w:p>
+      <w:pPr>
+        <w:keepNext/>
+        <w:spacing w:before="120"/>
+        <w:jc w:val="center"/>
+      </w:pPr>
+      <w:r>
+        <w:rPr>
+          <w:noProof/>
+        </w:rPr>
+        <w:drawing>
+          <wp:inline distT="0" distB="0" distL="0" distR="0" wp14:anchorId="14A32D71" wp14:editId="5312F96D">
+            <wp:extent cx="4772025" cy="6096000"/>
+            <wp:effectExtent l="0" t="0" r="0" b="0"/>
+            <wp:docPr id="12" name="Picture 12"/>
+            <wp:cNvGraphicFramePr>
+              <a:graphicFrameLocks xmlns:a="http://schemas.openxmlformats.org/drawingml/2006/main" noChangeAspect="1"/>
+            </wp:cNvGraphicFramePr>
+            <a:graphic xmlns:a="http://schemas.openxmlformats.org/drawingml/2006/main">
+              <a:graphicData uri="http://schemas.openxmlformats.org/drawingml/2006/picture">
+                <pic:pic xmlns:pic="http://schemas.openxmlformats.org/drawingml/2006/picture">
+                  <pic:nvPicPr>
+                    <pic:cNvPr id="0" name=""/>
+                    <pic:cNvPicPr>
+                      <a:picLocks noChangeAspect="1" noChangeArrowheads="1"/>
+                    </pic:cNvPicPr>
+                  </pic:nvPicPr>
+                  <pic:blipFill>
+                    <a:blip r:embed="rId24"/>
+                    <a:srcRect/>
+                    <a:stretch>
+                      <a:fillRect/>
+                    </a:stretch>
+                  </pic:blipFill>
+                  <pic:spPr bwMode="auto">
+                    <a:xfrm>
+                      <a:off x="0" y="0"/>
+                      <a:ext cx="4772025" cy="6096000"/>
+                    </a:xfrm>
+                    <a:prstGeom prst="rect">
+                      <a:avLst/>
+                    </a:prstGeom>
+                  </pic:spPr>
+                </pic:pic>
+              </a:graphicData>
+            </a:graphic>
+          </wp:inline>
+        </w:drawing>
+      </w:r>
+    </w:p>
+    <w:p>
+      <w:pPr>
+        <w:pStyle w:val="Caption"/>
+        <w:spacing w:before="160" w:after="80"/>
+        <w:jc w:val="center"/>
+      </w:pPr>
+      <w:bookmarkStart w:id="45" w:name="_Toc241589400"/>
+      <w:r>
+        <w:t xml:space="preserve">FIG- </w:t>
+      </w:r>
+      <w:r>
+        <w:fldChar w:fldCharType="begin"/>
+      </w:r>
+      <w:r>
+        <w:instrText>SEQ FIG</w:instrText>
+      </w:r>
+      <w:r>
+        <w:fldChar w:fldCharType="separate"/>
+      </w:r>
+      <w:r>
+        <w:rPr>
+          <w:noProof/>
+        </w:rPr>
+        <w:t>11</w:t>
+      </w:r>
+      <w:r>
+        <w:fldChar w:fldCharType="end"/>
+      </w:r>
+      <w:r>
+        <w:t xml:space="preserve"> FBPMNMutasiBalance</w:t>
+      </w:r>
+      <w:bookmarkEnd w:id="45"/>
     </w:p>
     <w:p>
       <w:pPr>
         <w:spacing w:after="80" w:line="276" w:lineRule="auto"/>
-      </w:pPr>
-      <w:r>
-        <w:rPr>
-          <w:i/>
-          <w:iCs/>
-          <w:color w:val="7F7F7F"/>
-        </w:rPr>
-        <w:t>[Gambar BPMN dan paragraf penjelasan, dibuat pada tahap berikutnya]</w:t>
+        <w:jc w:val="both"/>
+      </w:pPr>
+      <w:r>
+        <w:t>Menu Mutasi menampilkan pergerakan saldo milik Member. Setelah sesi login diperiksa, sistem mengambil mutasi Balance terbaru dari tabel balance_ledger dan riwayat Loyalty Points dari tabel loyalty_ledger. Setiap baris mutasi berisi jenis mutasi (isi Balance, bayar top-up, refund, hadiah referral, tukar poin, atau penyesuaian), nomor referensi, waktu, dan jumlahnya, sehingga Member dapat menelusuri asal setiap perubahan saldo.</w:t>
       </w:r>
     </w:p>
     <w:p>
@@ -9882,23 +11562,103 @@
           <w:numId w:val="2"/>
         </w:numPr>
       </w:pPr>
-      <w:bookmarkStart w:id="35" w:name="_Toc241588127"/>
-      <w:r>
+      <w:bookmarkStart w:id="46" w:name="_Toc241589365"/>
+      <w:r>
+        <w:lastRenderedPageBreak/>
         <w:t>BPMN Laporan dan Analitik Top-Up (Admin)</w:t>
       </w:r>
-      <w:bookmarkEnd w:id="35"/>
+      <w:bookmarkEnd w:id="46"/>
+    </w:p>
+    <w:p>
+      <w:pPr>
+        <w:keepNext/>
+        <w:spacing w:before="120"/>
+        <w:jc w:val="center"/>
+      </w:pPr>
+      <w:r>
+        <w:rPr>
+          <w:noProof/>
+        </w:rPr>
+        <w:drawing>
+          <wp:inline distT="0" distB="0" distL="0" distR="0" wp14:anchorId="19F7BF57" wp14:editId="50741FEE">
+            <wp:extent cx="5238750" cy="6096000"/>
+            <wp:effectExtent l="0" t="0" r="0" b="0"/>
+            <wp:docPr id="13" name="Picture 13"/>
+            <wp:cNvGraphicFramePr>
+              <a:graphicFrameLocks xmlns:a="http://schemas.openxmlformats.org/drawingml/2006/main" noChangeAspect="1"/>
+            </wp:cNvGraphicFramePr>
+            <a:graphic xmlns:a="http://schemas.openxmlformats.org/drawingml/2006/main">
+              <a:graphicData uri="http://schemas.openxmlformats.org/drawingml/2006/picture">
+                <pic:pic xmlns:pic="http://schemas.openxmlformats.org/drawingml/2006/picture">
+                  <pic:nvPicPr>
+                    <pic:cNvPr id="0" name=""/>
+                    <pic:cNvPicPr>
+                      <a:picLocks noChangeAspect="1" noChangeArrowheads="1"/>
+                    </pic:cNvPicPr>
+                  </pic:nvPicPr>
+                  <pic:blipFill>
+                    <a:blip r:embed="rId25"/>
+                    <a:srcRect/>
+                    <a:stretch>
+                      <a:fillRect/>
+                    </a:stretch>
+                  </pic:blipFill>
+                  <pic:spPr bwMode="auto">
+                    <a:xfrm>
+                      <a:off x="0" y="0"/>
+                      <a:ext cx="5238750" cy="6096000"/>
+                    </a:xfrm>
+                    <a:prstGeom prst="rect">
+                      <a:avLst/>
+                    </a:prstGeom>
+                  </pic:spPr>
+                </pic:pic>
+              </a:graphicData>
+            </a:graphic>
+          </wp:inline>
+        </w:drawing>
+      </w:r>
+    </w:p>
+    <w:p>
+      <w:pPr>
+        <w:pStyle w:val="Caption"/>
+        <w:spacing w:before="160" w:after="80"/>
+        <w:jc w:val="center"/>
+      </w:pPr>
+      <w:bookmarkStart w:id="47" w:name="_Toc241589401"/>
+      <w:r>
+        <w:t xml:space="preserve">FIG- </w:t>
+      </w:r>
+      <w:r>
+        <w:fldChar w:fldCharType="begin"/>
+      </w:r>
+      <w:r>
+        <w:instrText>SEQ FIG</w:instrText>
+      </w:r>
+      <w:r>
+        <w:fldChar w:fldCharType="separate"/>
+      </w:r>
+      <w:r>
+        <w:rPr>
+          <w:noProof/>
+        </w:rPr>
+        <w:t>12</w:t>
+      </w:r>
+      <w:r>
+        <w:fldChar w:fldCharType="end"/>
+      </w:r>
+      <w:r>
+        <w:t xml:space="preserve"> FBPMNLaporanAnalitik</w:t>
+      </w:r>
+      <w:bookmarkEnd w:id="47"/>
     </w:p>
     <w:p>
       <w:pPr>
         <w:spacing w:after="80" w:line="276" w:lineRule="auto"/>
-      </w:pPr>
-      <w:r>
-        <w:rPr>
-          <w:i/>
-          <w:iCs/>
-          <w:color w:val="7F7F7F"/>
-        </w:rPr>
-        <w:t>[Gambar BPMN dan paragraf penjelasan, dibuat pada tahap berikutnya]</w:t>
+        <w:jc w:val="both"/>
+      </w:pPr>
+      <w:r>
+        <w:t>Proses ini digunakan oleh Admin untuk memantau transaksi top-up. Setelah Admin membuka panel admin, sistem memeriksa peran dan izin akun tersebut, dan akses ditolak jika tidak memiliki izin. Pada menu Analitik Top-Up, sistem menghitung total pendapatan, jumlah transaksi sukses, jumlah akun game unik, dan rata-rata per transaksi, lalu mengelompokkan top-up sukses per ID akun game. Pada menu Top-Up &amp; Balance, Admin dapat mencari dan memeriksa daftar invoice top-up game dan pengisian Balance.</w:t>
       </w:r>
     </w:p>
     <w:p>
@@ -9909,11 +11669,11 @@
           <w:numId w:val="2"/>
         </w:numPr>
       </w:pPr>
-      <w:bookmarkStart w:id="36" w:name="_Toc241588128"/>
+      <w:bookmarkStart w:id="48" w:name="_Toc241589366"/>
       <w:r>
         <w:t>Rancangan Data dan Alur Data</w:t>
       </w:r>
-      <w:bookmarkEnd w:id="36"/>
+      <w:bookmarkEnd w:id="48"/>
     </w:p>
     <w:p>
       <w:pPr>
@@ -9923,11 +11683,11 @@
           <w:numId w:val="2"/>
         </w:numPr>
       </w:pPr>
-      <w:bookmarkStart w:id="37" w:name="_Toc241588129"/>
+      <w:bookmarkStart w:id="49" w:name="_Toc241589367"/>
       <w:r>
         <w:t>Diagram Konteks</w:t>
       </w:r>
-      <w:bookmarkEnd w:id="37"/>
+      <w:bookmarkEnd w:id="49"/>
     </w:p>
     <w:p>
       <w:pPr>
@@ -9950,11 +11710,12 @@
           <w:numId w:val="2"/>
         </w:numPr>
       </w:pPr>
-      <w:bookmarkStart w:id="38" w:name="_Toc241588130"/>
-      <w:r>
+      <w:bookmarkStart w:id="50" w:name="_Toc241589368"/>
+      <w:r>
+        <w:lastRenderedPageBreak/>
         <w:t>DFD Level 0</w:t>
       </w:r>
-      <w:bookmarkEnd w:id="38"/>
+      <w:bookmarkEnd w:id="50"/>
     </w:p>
     <w:p>
       <w:pPr>
@@ -9977,12 +11738,11 @@
           <w:numId w:val="2"/>
         </w:numPr>
       </w:pPr>
-      <w:bookmarkStart w:id="39" w:name="_Toc241588131"/>
-      <w:r>
-        <w:lastRenderedPageBreak/>
+      <w:bookmarkStart w:id="51" w:name="_Toc241589369"/>
+      <w:r>
         <w:t>DFD Level 1</w:t>
       </w:r>
-      <w:bookmarkEnd w:id="39"/>
+      <w:bookmarkEnd w:id="51"/>
     </w:p>
     <w:p>
       <w:pPr>
@@ -10005,11 +11765,11 @@
           <w:numId w:val="2"/>
         </w:numPr>
       </w:pPr>
-      <w:bookmarkStart w:id="40" w:name="_Toc241588132"/>
+      <w:bookmarkStart w:id="52" w:name="_Toc241589370"/>
       <w:r>
         <w:t>ER Diagram</w:t>
       </w:r>
-      <w:bookmarkEnd w:id="40"/>
+      <w:bookmarkEnd w:id="52"/>
     </w:p>
     <w:p>
       <w:pPr>
@@ -10032,11 +11792,11 @@
           <w:numId w:val="2"/>
         </w:numPr>
       </w:pPr>
-      <w:bookmarkStart w:id="41" w:name="_Toc241588133"/>
+      <w:bookmarkStart w:id="53" w:name="_Toc241589371"/>
       <w:r>
         <w:t>Basis Data Konseptual</w:t>
       </w:r>
-      <w:bookmarkEnd w:id="41"/>
+      <w:bookmarkEnd w:id="53"/>
     </w:p>
     <w:p>
       <w:pPr>
@@ -10059,11 +11819,11 @@
           <w:numId w:val="2"/>
         </w:numPr>
       </w:pPr>
-      <w:bookmarkStart w:id="42" w:name="_Toc241588134"/>
+      <w:bookmarkStart w:id="54" w:name="_Toc241589372"/>
       <w:r>
         <w:t>Struktur Tabel</w:t>
       </w:r>
-      <w:bookmarkEnd w:id="42"/>
+      <w:bookmarkEnd w:id="54"/>
     </w:p>
     <w:p>
       <w:pPr>
@@ -10086,11 +11846,11 @@
           <w:numId w:val="2"/>
         </w:numPr>
       </w:pPr>
-      <w:bookmarkStart w:id="43" w:name="_Toc241588135"/>
+      <w:bookmarkStart w:id="55" w:name="_Toc241589373"/>
       <w:r>
         <w:t>Rancangan User Interface</w:t>
       </w:r>
-      <w:bookmarkEnd w:id="43"/>
+      <w:bookmarkEnd w:id="55"/>
     </w:p>
     <w:p>
       <w:pPr>
@@ -10100,11 +11860,11 @@
           <w:numId w:val="2"/>
         </w:numPr>
       </w:pPr>
-      <w:bookmarkStart w:id="44" w:name="_Toc241588136"/>
+      <w:bookmarkStart w:id="56" w:name="_Toc241589374"/>
       <w:r>
         <w:t>Halaman Beranda</w:t>
       </w:r>
-      <w:bookmarkEnd w:id="44"/>
+      <w:bookmarkEnd w:id="56"/>
     </w:p>
     <w:p>
       <w:pPr>
@@ -10127,11 +11887,11 @@
           <w:numId w:val="2"/>
         </w:numPr>
       </w:pPr>
-      <w:bookmarkStart w:id="45" w:name="_Toc241588137"/>
+      <w:bookmarkStart w:id="57" w:name="_Toc241589375"/>
       <w:r>
         <w:t>Halaman Masuk</w:t>
       </w:r>
-      <w:bookmarkEnd w:id="45"/>
+      <w:bookmarkEnd w:id="57"/>
     </w:p>
     <w:p>
       <w:pPr>
@@ -10154,11 +11914,11 @@
           <w:numId w:val="2"/>
         </w:numPr>
       </w:pPr>
-      <w:bookmarkStart w:id="46" w:name="_Toc241588138"/>
+      <w:bookmarkStart w:id="58" w:name="_Toc241589376"/>
       <w:r>
         <w:t>Halaman Daftar</w:t>
       </w:r>
-      <w:bookmarkEnd w:id="46"/>
+      <w:bookmarkEnd w:id="58"/>
     </w:p>
     <w:p>
       <w:pPr>
@@ -10181,11 +11941,11 @@
           <w:numId w:val="2"/>
         </w:numPr>
       </w:pPr>
-      <w:bookmarkStart w:id="47" w:name="_Toc241588139"/>
+      <w:bookmarkStart w:id="59" w:name="_Toc241589377"/>
       <w:r>
         <w:t>Halaman Top-Up Game</w:t>
       </w:r>
-      <w:bookmarkEnd w:id="47"/>
+      <w:bookmarkEnd w:id="59"/>
     </w:p>
     <w:p>
       <w:pPr>
@@ -10208,11 +11968,11 @@
           <w:numId w:val="2"/>
         </w:numPr>
       </w:pPr>
-      <w:bookmarkStart w:id="48" w:name="_Toc241588140"/>
+      <w:bookmarkStart w:id="60" w:name="_Toc241589378"/>
       <w:r>
         <w:t>Halaman Form Top-Up</w:t>
       </w:r>
-      <w:bookmarkEnd w:id="48"/>
+      <w:bookmarkEnd w:id="60"/>
     </w:p>
     <w:p>
       <w:pPr>
@@ -10235,11 +11995,11 @@
           <w:numId w:val="2"/>
         </w:numPr>
       </w:pPr>
-      <w:bookmarkStart w:id="49" w:name="_Toc241588141"/>
+      <w:bookmarkStart w:id="61" w:name="_Toc241589379"/>
       <w:r>
         <w:t>Modal Invoice Dibuat</w:t>
       </w:r>
-      <w:bookmarkEnd w:id="49"/>
+      <w:bookmarkEnd w:id="61"/>
     </w:p>
     <w:p>
       <w:pPr>
@@ -10262,11 +12022,11 @@
           <w:numId w:val="2"/>
         </w:numPr>
       </w:pPr>
-      <w:bookmarkStart w:id="50" w:name="_Toc241588142"/>
+      <w:bookmarkStart w:id="62" w:name="_Toc241589380"/>
       <w:r>
         <w:t>Halaman Status Pembayaran</w:t>
       </w:r>
-      <w:bookmarkEnd w:id="50"/>
+      <w:bookmarkEnd w:id="62"/>
     </w:p>
     <w:p>
       <w:pPr>
@@ -10289,11 +12049,11 @@
           <w:numId w:val="2"/>
         </w:numPr>
       </w:pPr>
-      <w:bookmarkStart w:id="51" w:name="_Toc241588143"/>
+      <w:bookmarkStart w:id="63" w:name="_Toc241589381"/>
       <w:r>
         <w:t>Halaman Cek Invoice</w:t>
       </w:r>
-      <w:bookmarkEnd w:id="51"/>
+      <w:bookmarkEnd w:id="63"/>
     </w:p>
     <w:p>
       <w:pPr>
@@ -10316,11 +12076,11 @@
           <w:numId w:val="2"/>
         </w:numPr>
       </w:pPr>
-      <w:bookmarkStart w:id="52" w:name="_Toc241588144"/>
+      <w:bookmarkStart w:id="64" w:name="_Toc241589382"/>
       <w:r>
         <w:t>Halaman Balance</w:t>
       </w:r>
-      <w:bookmarkEnd w:id="52"/>
+      <w:bookmarkEnd w:id="64"/>
     </w:p>
     <w:p>
       <w:pPr>
@@ -10343,11 +12103,11 @@
           <w:numId w:val="2"/>
         </w:numPr>
       </w:pPr>
-      <w:bookmarkStart w:id="53" w:name="_Toc241588145"/>
+      <w:bookmarkStart w:id="65" w:name="_Toc241589383"/>
       <w:r>
         <w:t>Halaman Profil Saya</w:t>
       </w:r>
-      <w:bookmarkEnd w:id="53"/>
+      <w:bookmarkEnd w:id="65"/>
     </w:p>
     <w:p>
       <w:pPr>
@@ -10370,11 +12130,12 @@
           <w:numId w:val="2"/>
         </w:numPr>
       </w:pPr>
-      <w:bookmarkStart w:id="54" w:name="_Toc241588146"/>
-      <w:r>
+      <w:bookmarkStart w:id="66" w:name="_Toc241589384"/>
+      <w:r>
+        <w:lastRenderedPageBreak/>
         <w:t>Halaman Transaksi</w:t>
       </w:r>
-      <w:bookmarkEnd w:id="54"/>
+      <w:bookmarkEnd w:id="66"/>
     </w:p>
     <w:p>
       <w:pPr>
@@ -10397,12 +12158,11 @@
           <w:numId w:val="2"/>
         </w:numPr>
       </w:pPr>
-      <w:bookmarkStart w:id="55" w:name="_Toc241588147"/>
-      <w:r>
-        <w:lastRenderedPageBreak/>
+      <w:bookmarkStart w:id="67" w:name="_Toc241589385"/>
+      <w:r>
         <w:t>Halaman Mutasi</w:t>
       </w:r>
-      <w:bookmarkEnd w:id="55"/>
+      <w:bookmarkEnd w:id="67"/>
     </w:p>
     <w:p>
       <w:pPr>
@@ -10425,11 +12185,11 @@
           <w:numId w:val="2"/>
         </w:numPr>
       </w:pPr>
-      <w:bookmarkStart w:id="56" w:name="_Toc241588148"/>
+      <w:bookmarkStart w:id="68" w:name="_Toc241589386"/>
       <w:r>
         <w:t>Halaman Analitik Top-Up (Admin)</w:t>
       </w:r>
-      <w:bookmarkEnd w:id="56"/>
+      <w:bookmarkEnd w:id="68"/>
     </w:p>
     <w:p>
       <w:pPr>
@@ -10452,11 +12212,11 @@
           <w:numId w:val="2"/>
         </w:numPr>
       </w:pPr>
-      <w:bookmarkStart w:id="57" w:name="_Toc241588149"/>
+      <w:bookmarkStart w:id="69" w:name="_Toc241589387"/>
       <w:r>
         <w:t>Halaman Top-Up dan Balance (Admin)</w:t>
       </w:r>
-      <w:bookmarkEnd w:id="57"/>
+      <w:bookmarkEnd w:id="69"/>
     </w:p>
     <w:p>
       <w:pPr>
@@ -10479,11 +12239,11 @@
           <w:numId w:val="2"/>
         </w:numPr>
       </w:pPr>
-      <w:bookmarkStart w:id="58" w:name="_Toc241588150"/>
+      <w:bookmarkStart w:id="70" w:name="_Toc241589388"/>
       <w:r>
         <w:t>Tampilan Ponsel</w:t>
       </w:r>
-      <w:bookmarkEnd w:id="58"/>
+      <w:bookmarkEnd w:id="70"/>
     </w:p>
     <w:p>
       <w:pPr>
@@ -10507,18 +12267,18 @@
       <w:pPr>
         <w:pStyle w:val="Heading1"/>
       </w:pPr>
-      <w:bookmarkStart w:id="59" w:name="_Toc241588151"/>
+      <w:bookmarkStart w:id="71" w:name="_Toc241589389"/>
       <w:r>
         <w:lastRenderedPageBreak/>
         <w:t>Lampiran</w:t>
       </w:r>
-      <w:bookmarkEnd w:id="59"/>
+      <w:bookmarkEnd w:id="71"/>
     </w:p>
     <w:p>
       <w:pPr>
         <w:spacing w:after="120"/>
       </w:pPr>
-      <w:bookmarkStart w:id="60" w:name="lampiran1"/>
+      <w:bookmarkStart w:id="72" w:name="lampiran1"/>
       <w:r>
         <w:rPr>
           <w:b/>
@@ -10526,7 +12286,7 @@
         </w:rPr>
         <w:t>Lampiran 1. Pembagian Tugas Anggota Kelompok</w:t>
       </w:r>
-      <w:bookmarkEnd w:id="60"/>
+      <w:bookmarkEnd w:id="72"/>
     </w:p>
     <w:p>
       <w:pPr>
@@ -10551,7 +12311,7 @@
           <w:left w:w="10" w:type="dxa"/>
           <w:right w:w="10" w:type="dxa"/>
         </w:tblCellMar>
-        <w:tblLook w:val="0000" w:firstRow="0" w:lastRow="0" w:firstColumn="0" w:lastColumn="0" w:noHBand="0" w:noVBand="0"/>
+        <w:tblLook w:val="04A0" w:firstRow="1" w:lastRow="0" w:firstColumn="1" w:lastColumn="0" w:noHBand="0" w:noVBand="1"/>
       </w:tblPr>
       <w:tblGrid>
         <w:gridCol w:w="1379"/>
@@ -10973,7 +12733,7 @@
     </w:tbl>
     <w:p/>
     <w:sectPr>
-      <w:footerReference w:type="default" r:id="rId14"/>
+      <w:footerReference w:type="default" r:id="rId26"/>
       <w:pgSz w:w="11906" w:h="16838"/>
       <w:pgMar w:top="1440" w:right="1440" w:bottom="1440" w:left="1440" w:header="720" w:footer="720" w:gutter="0"/>
       <w:cols w:space="720"/>
@@ -11049,7 +12809,7 @@
         <w:left w:w="10" w:type="dxa"/>
         <w:right w:w="10" w:type="dxa"/>
       </w:tblCellMar>
-      <w:tblLook w:val="0000" w:firstRow="0" w:lastRow="0" w:firstColumn="0" w:lastColumn="0" w:noHBand="0" w:noVBand="0"/>
+      <w:tblLook w:val="04A0" w:firstRow="1" w:lastRow="0" w:firstColumn="1" w:lastColumn="0" w:noHBand="0" w:noVBand="1"/>
     </w:tblPr>
     <w:tblGrid>
       <w:gridCol w:w="2600"/>
@@ -11268,9 +13028,9 @@
 <file path=word/numbering.xml><?xml version="1.0" encoding="utf-8"?>
 <w:numbering xmlns:wpc="http://schemas.microsoft.com/office/word/2010/wordprocessingCanvas" xmlns:cx="http://schemas.microsoft.com/office/drawing/2014/chartex" xmlns:cx1="http://schemas.microsoft.com/office/drawing/2015/9/8/chartex" xmlns:cx2="http://schemas.microsoft.com/office/drawing/2015/10/21/chartex" xmlns:cx3="http://schemas.microsoft.com/office/drawing/2016/5/9/chartex" xmlns:cx4="http://schemas.microsoft.com/office/drawing/2016/5/10/chartex" xmlns:cx5="http://schemas.microsoft.com/office/drawing/2016/5/11/chartex" xmlns:cx6="http://schemas.microsoft.com/office/drawing/2016/5/12/chartex" xmlns:cx7="http://schemas.microsoft.com/office/drawing/2016/5/13/chartex" xmlns:cx8="http://schemas.microsoft.com/office/drawing/2016/5/14/chartex" xmlns:mc="http://schemas.openxmlformats.org/markup-compatibility/2006" xmlns:aink="http://schemas.microsoft.com/office/drawing/2016/ink" xmlns:am3d="http://schemas.microsoft.com/office/drawing/2017/model3d" xmlns:o="urn:schemas-microsoft-com:office:office" xmlns:oel="http://schemas.microsoft.com/office/2019/extlst" xmlns:r="http://schemas.openxmlformats.org/officeDocument/2006/relationships" xmlns:m="http://schemas.openxmlformats.org/officeDocument/2006/math" xmlns:v="urn:schemas-microsoft-com:vml" xmlns:wp14="http://schemas.microsoft.com/office/word/2010/wordprocessingDrawing" xmlns:wp="http://schemas.openxmlformats.org/drawingml/2006/wordprocessingDrawing" xmlns:w10="urn:schemas-microsoft-com:office:word" xmlns:w="http://schemas.openxmlformats.org/wordprocessingml/2006/main" xmlns:w14="http://schemas.microsoft.com/office/word/2010/wordml" xmlns:w15="http://schemas.microsoft.com/office/word/2012/wordml" xmlns:w16cex="http://schemas.microsoft.com/office/word/2018/wordml/cex" xmlns:w16cid="http://schemas.microsoft.com/office/word/2016/wordml/cid" xmlns:w16="http://schemas.microsoft.com/office/word/2018/wordml" xmlns:w16du="http://schemas.microsoft.com/office/word/2023/wordml/word16du" xmlns:w16sdtdh="http://schemas.microsoft.com/office/word/2020/wordml/sdtdatahash" xmlns:w16sdtfl="http://schemas.microsoft.com/office/word/2024/wordml/sdtformatlock" xmlns:w16se="http://schemas.microsoft.com/office/word/2015/wordml/symex" xmlns:wpg="http://schemas.microsoft.com/office/word/2010/wordprocessingGroup" xmlns:wpi="http://schemas.microsoft.com/office/word/2010/wordprocessingInk" xmlns:wne="http://schemas.microsoft.com/office/word/2006/wordml" xmlns:wps="http://schemas.microsoft.com/office/word/2010/wordprocessingShape" mc:Ignorable="w14 w15 w16se w16cid w16 w16cex w16sdtdh w16sdtfl w16du wp14">
   <w:abstractNum w:abstractNumId="0" w15:restartNumberingAfterBreak="0">
-    <w:nsid w:val="080C72BA"/>
+    <w:nsid w:val="162663C4"/>
     <w:multiLevelType w:val="multilevel"/>
-    <w:tmpl w:val="3E70BE8A"/>
+    <w:tmpl w:val="34C4C35A"/>
     <w:lvl w:ilvl="0">
       <w:start w:val="1"/>
       <w:numFmt w:val="decimal"/>
@@ -11330,10 +13090,96 @@
     </w:lvl>
   </w:abstractNum>
   <w:abstractNum w:abstractNumId="1" w15:restartNumberingAfterBreak="0">
-    <w:nsid w:val="080D14C1"/>
+    <w:nsid w:val="1F1B1276"/>
     <w:multiLevelType w:val="hybridMultilevel"/>
-    <w:tmpl w:val="DF824214"/>
-    <w:lvl w:ilvl="0" w:tplc="4E20A18A">
+    <w:tmpl w:val="36CCA974"/>
+    <w:lvl w:ilvl="0" w:tplc="62F4A852" w:tentative="1">
+      <w:start w:val="1"/>
+      <w:numFmt w:val="bullet"/>
+      <w:lvlText w:val="●"/>
+      <w:lvlJc w:val="left"/>
+      <w:pPr>
+        <w:ind w:left="720" w:hanging="360"/>
+      </w:pPr>
+    </w:lvl>
+    <w:lvl w:ilvl="1" w:tplc="DFB237BC" w:tentative="1">
+      <w:start w:val="1"/>
+      <w:numFmt w:val="bullet"/>
+      <w:lvlText w:val="○"/>
+      <w:lvlJc w:val="left"/>
+      <w:pPr>
+        <w:ind w:left="1440" w:hanging="360"/>
+      </w:pPr>
+    </w:lvl>
+    <w:lvl w:ilvl="2" w:tplc="A4EEF026" w:tentative="1">
+      <w:start w:val="1"/>
+      <w:numFmt w:val="bullet"/>
+      <w:lvlText w:val="■"/>
+      <w:lvlJc w:val="left"/>
+      <w:pPr>
+        <w:ind w:left="2160" w:hanging="360"/>
+      </w:pPr>
+    </w:lvl>
+    <w:lvl w:ilvl="3" w:tplc="A754B080" w:tentative="1">
+      <w:start w:val="1"/>
+      <w:numFmt w:val="bullet"/>
+      <w:lvlText w:val="●"/>
+      <w:lvlJc w:val="left"/>
+      <w:pPr>
+        <w:ind w:left="2880" w:hanging="360"/>
+      </w:pPr>
+    </w:lvl>
+    <w:lvl w:ilvl="4" w:tplc="C88C4E8A" w:tentative="1">
+      <w:start w:val="1"/>
+      <w:numFmt w:val="bullet"/>
+      <w:lvlText w:val="○"/>
+      <w:lvlJc w:val="left"/>
+      <w:pPr>
+        <w:ind w:left="3600" w:hanging="360"/>
+      </w:pPr>
+    </w:lvl>
+    <w:lvl w:ilvl="5" w:tplc="67FC92FE" w:tentative="1">
+      <w:start w:val="1"/>
+      <w:numFmt w:val="bullet"/>
+      <w:lvlText w:val="■"/>
+      <w:lvlJc w:val="left"/>
+      <w:pPr>
+        <w:ind w:left="4320" w:hanging="360"/>
+      </w:pPr>
+    </w:lvl>
+    <w:lvl w:ilvl="6" w:tplc="9E5E1276" w:tentative="1">
+      <w:start w:val="1"/>
+      <w:numFmt w:val="bullet"/>
+      <w:lvlText w:val="●"/>
+      <w:lvlJc w:val="left"/>
+      <w:pPr>
+        <w:ind w:left="5040" w:hanging="360"/>
+      </w:pPr>
+    </w:lvl>
+    <w:lvl w:ilvl="7" w:tplc="926E03A0" w:tentative="1">
+      <w:start w:val="1"/>
+      <w:numFmt w:val="bullet"/>
+      <w:lvlText w:val="●"/>
+      <w:lvlJc w:val="left"/>
+      <w:pPr>
+        <w:ind w:left="5760" w:hanging="360"/>
+      </w:pPr>
+    </w:lvl>
+    <w:lvl w:ilvl="8" w:tplc="4DC4CF66" w:tentative="1">
+      <w:start w:val="1"/>
+      <w:numFmt w:val="bullet"/>
+      <w:lvlText w:val="●"/>
+      <w:lvlJc w:val="left"/>
+      <w:pPr>
+        <w:ind w:left="6480" w:hanging="360"/>
+      </w:pPr>
+    </w:lvl>
+  </w:abstractNum>
+  <w:abstractNum w:abstractNumId="2" w15:restartNumberingAfterBreak="0">
+    <w:nsid w:val="2EF94B47"/>
+    <w:multiLevelType w:val="hybridMultilevel"/>
+    <w:tmpl w:val="6D7A3CA4"/>
+    <w:lvl w:ilvl="0" w:tplc="D16C95A0">
       <w:start w:val="1"/>
       <w:numFmt w:val="bullet"/>
       <w:lvlText w:val="•"/>
@@ -11342,7 +13188,7 @@
         <w:ind w:left="360" w:hanging="360"/>
       </w:pPr>
     </w:lvl>
-    <w:lvl w:ilvl="1" w:tplc="979CAFFA">
+    <w:lvl w:ilvl="1" w:tplc="B406EB1C">
       <w:start w:val="1"/>
       <w:numFmt w:val="bullet"/>
       <w:lvlText w:val="•"/>
@@ -11351,133 +13197,47 @@
         <w:ind w:left="1080" w:hanging="360"/>
       </w:pPr>
     </w:lvl>
-    <w:lvl w:ilvl="2" w:tplc="8F68FE2C">
+    <w:lvl w:ilvl="2" w:tplc="58DEB23E">
       <w:numFmt w:val="decimal"/>
       <w:lvlText w:val=""/>
       <w:lvlJc w:val="left"/>
     </w:lvl>
-    <w:lvl w:ilvl="3" w:tplc="8076B296">
+    <w:lvl w:ilvl="3" w:tplc="707E3186">
       <w:numFmt w:val="decimal"/>
       <w:lvlText w:val=""/>
       <w:lvlJc w:val="left"/>
     </w:lvl>
-    <w:lvl w:ilvl="4" w:tplc="AFBEC34C">
+    <w:lvl w:ilvl="4" w:tplc="540249D2">
       <w:numFmt w:val="decimal"/>
       <w:lvlText w:val=""/>
       <w:lvlJc w:val="left"/>
     </w:lvl>
-    <w:lvl w:ilvl="5" w:tplc="E0A47580">
+    <w:lvl w:ilvl="5" w:tplc="95CE81D0">
       <w:numFmt w:val="decimal"/>
       <w:lvlText w:val=""/>
       <w:lvlJc w:val="left"/>
     </w:lvl>
-    <w:lvl w:ilvl="6" w:tplc="1B18E0F6">
+    <w:lvl w:ilvl="6" w:tplc="9842C3AC">
       <w:numFmt w:val="decimal"/>
       <w:lvlText w:val=""/>
       <w:lvlJc w:val="left"/>
     </w:lvl>
-    <w:lvl w:ilvl="7" w:tplc="BD4EE596">
+    <w:lvl w:ilvl="7" w:tplc="576427A4">
       <w:numFmt w:val="decimal"/>
       <w:lvlText w:val=""/>
       <w:lvlJc w:val="left"/>
     </w:lvl>
-    <w:lvl w:ilvl="8" w:tplc="6B2CF74E">
+    <w:lvl w:ilvl="8" w:tplc="168C7E36">
       <w:numFmt w:val="decimal"/>
       <w:lvlText w:val=""/>
       <w:lvlJc w:val="left"/>
     </w:lvl>
   </w:abstractNum>
-  <w:abstractNum w:abstractNumId="2" w15:restartNumberingAfterBreak="0">
-    <w:nsid w:val="59140C7D"/>
+  <w:abstractNum w:abstractNumId="3" w15:restartNumberingAfterBreak="0">
+    <w:nsid w:val="44B05412"/>
     <w:multiLevelType w:val="hybridMultilevel"/>
-    <w:tmpl w:val="F4445DF2"/>
-    <w:lvl w:ilvl="0" w:tplc="830626CC" w:tentative="1">
-      <w:start w:val="1"/>
-      <w:numFmt w:val="bullet"/>
-      <w:lvlText w:val="●"/>
-      <w:lvlJc w:val="left"/>
-      <w:pPr>
-        <w:ind w:left="720" w:hanging="360"/>
-      </w:pPr>
-    </w:lvl>
-    <w:lvl w:ilvl="1" w:tplc="B78C18FC" w:tentative="1">
-      <w:start w:val="1"/>
-      <w:numFmt w:val="bullet"/>
-      <w:lvlText w:val="○"/>
-      <w:lvlJc w:val="left"/>
-      <w:pPr>
-        <w:ind w:left="1440" w:hanging="360"/>
-      </w:pPr>
-    </w:lvl>
-    <w:lvl w:ilvl="2" w:tplc="DEC6E4B4" w:tentative="1">
-      <w:start w:val="1"/>
-      <w:numFmt w:val="bullet"/>
-      <w:lvlText w:val="■"/>
-      <w:lvlJc w:val="left"/>
-      <w:pPr>
-        <w:ind w:left="2160" w:hanging="360"/>
-      </w:pPr>
-    </w:lvl>
-    <w:lvl w:ilvl="3" w:tplc="5DF4B208" w:tentative="1">
-      <w:start w:val="1"/>
-      <w:numFmt w:val="bullet"/>
-      <w:lvlText w:val="●"/>
-      <w:lvlJc w:val="left"/>
-      <w:pPr>
-        <w:ind w:left="2880" w:hanging="360"/>
-      </w:pPr>
-    </w:lvl>
-    <w:lvl w:ilvl="4" w:tplc="62F23452" w:tentative="1">
-      <w:start w:val="1"/>
-      <w:numFmt w:val="bullet"/>
-      <w:lvlText w:val="○"/>
-      <w:lvlJc w:val="left"/>
-      <w:pPr>
-        <w:ind w:left="3600" w:hanging="360"/>
-      </w:pPr>
-    </w:lvl>
-    <w:lvl w:ilvl="5" w:tplc="BA586592" w:tentative="1">
-      <w:start w:val="1"/>
-      <w:numFmt w:val="bullet"/>
-      <w:lvlText w:val="■"/>
-      <w:lvlJc w:val="left"/>
-      <w:pPr>
-        <w:ind w:left="4320" w:hanging="360"/>
-      </w:pPr>
-    </w:lvl>
-    <w:lvl w:ilvl="6" w:tplc="FACC075E" w:tentative="1">
-      <w:start w:val="1"/>
-      <w:numFmt w:val="bullet"/>
-      <w:lvlText w:val="●"/>
-      <w:lvlJc w:val="left"/>
-      <w:pPr>
-        <w:ind w:left="5040" w:hanging="360"/>
-      </w:pPr>
-    </w:lvl>
-    <w:lvl w:ilvl="7" w:tplc="1E7E300A" w:tentative="1">
-      <w:start w:val="1"/>
-      <w:numFmt w:val="bullet"/>
-      <w:lvlText w:val="●"/>
-      <w:lvlJc w:val="left"/>
-      <w:pPr>
-        <w:ind w:left="5760" w:hanging="360"/>
-      </w:pPr>
-    </w:lvl>
-    <w:lvl w:ilvl="8" w:tplc="697AE478" w:tentative="1">
-      <w:start w:val="1"/>
-      <w:numFmt w:val="bullet"/>
-      <w:lvlText w:val="●"/>
-      <w:lvlJc w:val="left"/>
-      <w:pPr>
-        <w:ind w:left="6480" w:hanging="360"/>
-      </w:pPr>
-    </w:lvl>
-  </w:abstractNum>
-  <w:abstractNum w:abstractNumId="3" w15:restartNumberingAfterBreak="0">
-    <w:nsid w:val="68E74182"/>
-    <w:multiLevelType w:val="hybridMultilevel"/>
-    <w:tmpl w:val="D19C0EA0"/>
-    <w:lvl w:ilvl="0" w:tplc="5D46DADA">
+    <w:tmpl w:val="02225380"/>
+    <w:lvl w:ilvl="0" w:tplc="BF92F94E">
       <w:start w:val="1"/>
       <w:numFmt w:val="decimal"/>
       <w:lvlText w:val="%1."/>
@@ -11486,96 +13246,96 @@
         <w:ind w:left="720" w:hanging="360"/>
       </w:pPr>
     </w:lvl>
-    <w:lvl w:ilvl="1" w:tplc="942A809E">
+    <w:lvl w:ilvl="1" w:tplc="DFDCBAC2">
       <w:numFmt w:val="decimal"/>
       <w:lvlText w:val=""/>
       <w:lvlJc w:val="left"/>
     </w:lvl>
-    <w:lvl w:ilvl="2" w:tplc="927E8BD4">
+    <w:lvl w:ilvl="2" w:tplc="4F225D08">
       <w:numFmt w:val="decimal"/>
       <w:lvlText w:val=""/>
       <w:lvlJc w:val="left"/>
     </w:lvl>
-    <w:lvl w:ilvl="3" w:tplc="EC9CB978">
+    <w:lvl w:ilvl="3" w:tplc="52E44828">
       <w:numFmt w:val="decimal"/>
       <w:lvlText w:val=""/>
       <w:lvlJc w:val="left"/>
     </w:lvl>
-    <w:lvl w:ilvl="4" w:tplc="EA5A2380">
+    <w:lvl w:ilvl="4" w:tplc="A8A8D118">
       <w:numFmt w:val="decimal"/>
       <w:lvlText w:val=""/>
       <w:lvlJc w:val="left"/>
     </w:lvl>
-    <w:lvl w:ilvl="5" w:tplc="27101D5E">
+    <w:lvl w:ilvl="5" w:tplc="14B6FB8A">
       <w:numFmt w:val="decimal"/>
       <w:lvlText w:val=""/>
       <w:lvlJc w:val="left"/>
     </w:lvl>
-    <w:lvl w:ilvl="6" w:tplc="05CEFB84">
+    <w:lvl w:ilvl="6" w:tplc="6BBC8F3A">
       <w:numFmt w:val="decimal"/>
       <w:lvlText w:val=""/>
       <w:lvlJc w:val="left"/>
     </w:lvl>
-    <w:lvl w:ilvl="7" w:tplc="B866D60C">
+    <w:lvl w:ilvl="7" w:tplc="16947FAE">
       <w:numFmt w:val="decimal"/>
       <w:lvlText w:val=""/>
       <w:lvlJc w:val="left"/>
     </w:lvl>
-    <w:lvl w:ilvl="8" w:tplc="3334E16A">
+    <w:lvl w:ilvl="8" w:tplc="9FD088DC">
       <w:numFmt w:val="decimal"/>
       <w:lvlText w:val=""/>
       <w:lvlJc w:val="left"/>
     </w:lvl>
   </w:abstractNum>
-  <w:num w:numId="1" w16cid:durableId="262108753">
+  <w:num w:numId="1" w16cid:durableId="1962422178">
+    <w:abstractNumId w:val="1"/>
+    <w:lvlOverride w:ilvl="0">
+      <w:startOverride w:val="1"/>
+    </w:lvlOverride>
+  </w:num>
+  <w:num w:numId="2" w16cid:durableId="173342859">
+    <w:abstractNumId w:val="0"/>
+    <w:lvlOverride w:ilvl="0">
+      <w:startOverride w:val="1"/>
+    </w:lvlOverride>
+  </w:num>
+  <w:num w:numId="3" w16cid:durableId="522862533">
+    <w:abstractNumId w:val="3"/>
+    <w:lvlOverride w:ilvl="0">
+      <w:startOverride w:val="1"/>
+    </w:lvlOverride>
+  </w:num>
+  <w:num w:numId="4" w16cid:durableId="1917519604">
+    <w:abstractNumId w:val="3"/>
+    <w:lvlOverride w:ilvl="0">
+      <w:startOverride w:val="1"/>
+    </w:lvlOverride>
+  </w:num>
+  <w:num w:numId="5" w16cid:durableId="569268404">
     <w:abstractNumId w:val="2"/>
     <w:lvlOverride w:ilvl="0">
       <w:startOverride w:val="1"/>
     </w:lvlOverride>
   </w:num>
-  <w:num w:numId="2" w16cid:durableId="387530114">
-    <w:abstractNumId w:val="0"/>
-    <w:lvlOverride w:ilvl="0">
-      <w:startOverride w:val="1"/>
-    </w:lvlOverride>
-  </w:num>
-  <w:num w:numId="3" w16cid:durableId="95760751">
+  <w:num w:numId="6" w16cid:durableId="1903715622">
     <w:abstractNumId w:val="3"/>
     <w:lvlOverride w:ilvl="0">
       <w:startOverride w:val="1"/>
     </w:lvlOverride>
   </w:num>
-  <w:num w:numId="4" w16cid:durableId="1857424190">
+  <w:num w:numId="7" w16cid:durableId="2098556691">
     <w:abstractNumId w:val="3"/>
     <w:lvlOverride w:ilvl="0">
       <w:startOverride w:val="1"/>
     </w:lvlOverride>
   </w:num>
-  <w:num w:numId="5" w16cid:durableId="786198823">
-    <w:abstractNumId w:val="1"/>
-    <w:lvlOverride w:ilvl="0">
-      <w:startOverride w:val="1"/>
-    </w:lvlOverride>
-  </w:num>
-  <w:num w:numId="6" w16cid:durableId="1300501308">
+  <w:num w:numId="8" w16cid:durableId="610168511">
     <w:abstractNumId w:val="3"/>
     <w:lvlOverride w:ilvl="0">
       <w:startOverride w:val="1"/>
     </w:lvlOverride>
   </w:num>
-  <w:num w:numId="7" w16cid:durableId="1222015411">
-    <w:abstractNumId w:val="3"/>
-    <w:lvlOverride w:ilvl="0">
-      <w:startOverride w:val="1"/>
-    </w:lvlOverride>
-  </w:num>
-  <w:num w:numId="8" w16cid:durableId="1906181407">
-    <w:abstractNumId w:val="3"/>
-    <w:lvlOverride w:ilvl="0">
-      <w:startOverride w:val="1"/>
-    </w:lvlOverride>
-  </w:num>
-  <w:num w:numId="9" w16cid:durableId="430398154">
+  <w:num w:numId="9" w16cid:durableId="762535613">
     <w:abstractNumId w:val="3"/>
     <w:lvlOverride w:ilvl="0">
       <w:startOverride w:val="1"/>
@@ -12233,7 +13993,7 @@
     <w:autoRedefine/>
     <w:uiPriority w:val="39"/>
     <w:unhideWhenUsed/>
-    <w:rsid w:val="00612E7C"/>
+    <w:rsid w:val="00BB21EB"/>
     <w:pPr>
       <w:spacing w:after="100"/>
     </w:pPr>
@@ -12245,7 +14005,7 @@
     <w:autoRedefine/>
     <w:uiPriority w:val="39"/>
     <w:unhideWhenUsed/>
-    <w:rsid w:val="00612E7C"/>
+    <w:rsid w:val="00BB21EB"/>
     <w:pPr>
       <w:spacing w:after="100"/>
       <w:ind w:left="220"/>
@@ -12258,7 +14018,7 @@
     <w:autoRedefine/>
     <w:uiPriority w:val="39"/>
     <w:unhideWhenUsed/>
-    <w:rsid w:val="00612E7C"/>
+    <w:rsid w:val="00BB21EB"/>
     <w:pPr>
       <w:spacing w:after="100"/>
       <w:ind w:left="440"/>
@@ -12270,7 +14030,7 @@
     <w:next w:val="Normal"/>
     <w:uiPriority w:val="99"/>
     <w:unhideWhenUsed/>
-    <w:rsid w:val="00612E7C"/>
+    <w:rsid w:val="00BB21EB"/>
   </w:style>
   <w:style w:type="paragraph" w:styleId="Header">
     <w:name w:val="header"/>
@@ -12278,7 +14038,7 @@
     <w:link w:val="HeaderChar"/>
     <w:uiPriority w:val="99"/>
     <w:unhideWhenUsed/>
-    <w:rsid w:val="00612E7C"/>
+    <w:rsid w:val="00BB21EB"/>
     <w:pPr>
       <w:tabs>
         <w:tab w:val="center" w:pos="4513"/>
@@ -12291,7 +14051,7 @@
     <w:basedOn w:val="DefaultParagraphFont"/>
     <w:link w:val="Header"/>
     <w:uiPriority w:val="99"/>
-    <w:rsid w:val="00612E7C"/>
+    <w:rsid w:val="00BB21EB"/>
   </w:style>
   <w:style w:type="paragraph" w:styleId="Footer">
     <w:name w:val="footer"/>
@@ -12299,7 +14059,7 @@
     <w:link w:val="FooterChar"/>
     <w:uiPriority w:val="99"/>
     <w:unhideWhenUsed/>
-    <w:rsid w:val="00612E7C"/>
+    <w:rsid w:val="00BB21EB"/>
     <w:pPr>
       <w:tabs>
         <w:tab w:val="center" w:pos="4513"/>
@@ -12312,7 +14072,7 @@
     <w:basedOn w:val="DefaultParagraphFont"/>
     <w:link w:val="Footer"/>
     <w:uiPriority w:val="99"/>
-    <w:rsid w:val="00612E7C"/>
+    <w:rsid w:val="00BB21EB"/>
   </w:style>
 </w:styles>
 </file>

</xml_diff>